<commit_message>
Nueva versión: Morse con control remoto IR y pantalla LCD
- Sketch morse_ir_lcd: receptor VS1838B + IRremote, pulsación corta/larga
  como punto/raya, decodificación y visualización en LCD 16x2 I2C.
- Versión con láser movida a version_laser/.
- Marco teórico y README actualizados a la nueva propuesta.
</commit_message>
<xml_diff>
--- a/docs/Marco_Teorico_Luz_Invisible_Morse.docx
+++ b/docs/Marco_Teorico_Luz_Invisible_Morse.docx
@@ -1011,39 +1011,41 @@
     <w:p>
       <w:pPr>
         <w:spacing w:line="360" w:lineRule="auto"/>
-        <w:rPr>
-          <w:rFonts w:ascii="Times New Roman" w:cs="Times New Roman" w:eastAsia="Times New Roman" w:hAnsi="Times New Roman"/>
-          <w:sz w:val="24"/>
-          <w:szCs w:val="24"/>
-        </w:rPr>
-      </w:pPr>
-      <w:r>
-        <w:rPr>
-          <w:rFonts w:ascii="Times New Roman" w:cs="Times New Roman" w:eastAsia="Times New Roman" w:hAnsi="Times New Roman"/>
-          <w:sz w:val="24"/>
-          <w:szCs w:val="24"/>
-          <w:rtl w:val="0"/>
-        </w:rPr>
-        <w:t xml:space="preserve">El presente proyecto de investigación aborda el estudio, diseño y evaluación práctica de sistemas de Comunicación por Luz Invisible (ILC / FSO - Free Space Optics) utilizando un diodo láser infrarrojo (IR) como emisor óptico directo. La investigación tendra como propósito analizar los principios físicos, electroópticos y la propagación de haces colimados para la transmisión inalámbrica de caracteres codificados en código Morse. </w:t>
-      </w:r>
-    </w:p>
-    <w:p>
-      <w:pPr>
-        <w:spacing w:line="360" w:lineRule="auto"/>
-        <w:rPr>
-          <w:rFonts w:ascii="Times New Roman" w:cs="Times New Roman" w:eastAsia="Times New Roman" w:hAnsi="Times New Roman"/>
-          <w:sz w:val="24"/>
-          <w:szCs w:val="24"/>
-        </w:rPr>
-      </w:pPr>
-      <w:r>
-        <w:rPr>
-          <w:rFonts w:ascii="Times New Roman" w:cs="Times New Roman" w:eastAsia="Times New Roman" w:hAnsi="Times New Roman"/>
-          <w:sz w:val="24"/>
-          <w:szCs w:val="24"/>
-          <w:rtl w:val="0"/>
-        </w:rPr>
-        <w:t xml:space="preserve">Se desarrollará un prototipo experimental capaz de codificar texto o impulsos de entrada en pulsos continuos/discontinuos de luz invisible , A través de este trabajo se pretende evaluar la precisión en la demodulación del código Morse, el tiempo de respuesta del sensor, el rango de alcance del láser frente a la alineación direccional y el impacto atenuante del ruido óptico ambiental. </w:t>
+        <w:jc w:val="both"/>
+        <w:rPr>
+          <w:rFonts w:ascii="Times New Roman" w:cs="Times New Roman" w:eastAsia="Times New Roman" w:hAnsi="Times New Roman"/>
+          <w:sz w:val="24"/>
+          <w:szCs w:val="24"/>
+        </w:rPr>
+      </w:pPr>
+      <w:r>
+        <w:rPr>
+          <w:rFonts w:ascii="Times New Roman" w:cs="Times New Roman" w:eastAsia="Times New Roman" w:hAnsi="Times New Roman"/>
+          <w:sz w:val="24"/>
+          <w:szCs w:val="24"/>
+          <w:rtl w:val="0"/>
+        </w:rPr>
+        <w:t xml:space="preserve">El presente proyecto aborda el estudio, diseño y evaluación práctica de un sistema de comunicación por luz invisible, en el que la información se transmite mediante radiación infrarroja (IR) emitida por un control remoto convencional. Cada pulsación del control corresponde a un símbolo del código Morse: una pulsación corta representa un punto y una pulsación larga representa una raya. La señal infrarroja es captada por un módulo receptor IR (VS1838B / TSOP1838) conectado a un microcontrolador Arduino, que mide la duración de cada pulsación, decodifica los caracteres y muestra el mensaje en una pantalla LCD de 16x2.</w:t>
+      </w:r>
+    </w:p>
+    <w:p>
+      <w:pPr>
+        <w:spacing w:line="360" w:lineRule="auto"/>
+        <w:jc w:val="both"/>
+        <w:rPr>
+          <w:rFonts w:ascii="Times New Roman" w:cs="Times New Roman" w:eastAsia="Times New Roman" w:hAnsi="Times New Roman"/>
+          <w:sz w:val="24"/>
+          <w:szCs w:val="24"/>
+        </w:rPr>
+      </w:pPr>
+      <w:r>
+        <w:rPr>
+          <w:rFonts w:ascii="Times New Roman" w:cs="Times New Roman" w:eastAsia="Times New Roman" w:hAnsi="Times New Roman"/>
+          <w:sz w:val="24"/>
+          <w:szCs w:val="24"/>
+          <w:rtl w:val="0"/>
+        </w:rPr>
+        <w:t xml:space="preserve">La luz emitida por el control se encuentra modulada sobre una portadora de 38 kHz, y el receptor incorpora un filtro pasabanda y un demodulador que solo responden a esa frecuencia. Esto permite estudiar en la práctica conceptos de Teoría de Señales como la modulación, el filtrado, la demodulación y la inmunidad al ruido óptico ambiental. A través de este trabajo se pretende evaluar la precisión en la decodificación del código Morse, el tiempo de respuesta del sistema, el alcance y el ángulo de recepción, y el efecto de la luz ambiental sobre la comunicación.</w:t>
       </w:r>
     </w:p>
     <w:p>
@@ -1097,29 +1099,22 @@
     </w:p>
     <w:p>
       <w:pPr>
-        <w:pBdr>
-          <w:top w:space="0" w:sz="0" w:val="nil"/>
-          <w:left w:space="0" w:sz="0" w:val="nil"/>
-          <w:bottom w:space="0" w:sz="0" w:val="nil"/>
-          <w:right w:space="0" w:sz="0" w:val="nil"/>
-          <w:between w:space="0" w:sz="0" w:val="nil"/>
-        </w:pBdr>
-        <w:shd w:fill="auto" w:val="clear"/>
-        <w:spacing w:line="360" w:lineRule="auto"/>
-        <w:rPr>
-          <w:rFonts w:ascii="Times New Roman" w:cs="Times New Roman" w:eastAsia="Times New Roman" w:hAnsi="Times New Roman"/>
-          <w:sz w:val="24"/>
-          <w:szCs w:val="24"/>
-        </w:rPr>
-      </w:pPr>
-      <w:r>
-        <w:rPr>
-          <w:rFonts w:ascii="Times New Roman" w:cs="Times New Roman" w:eastAsia="Times New Roman" w:hAnsi="Times New Roman"/>
-          <w:sz w:val="24"/>
-          <w:szCs w:val="24"/>
-          <w:rtl w:val="0"/>
-        </w:rPr>
-        <w:t xml:space="preserve">Diseñar, implementar y evaluar experimentalmente un prototipo funcional de transmisión y recepción de datos mediante luz invisible (láser infrarrojo), demostrando la viabilidad de la codificación y demodulación de señales en </w:t>
+        <w:spacing w:line="360" w:lineRule="auto"/>
+        <w:jc w:val="both"/>
+        <w:rPr>
+          <w:rFonts w:ascii="Times New Roman" w:cs="Times New Roman" w:eastAsia="Times New Roman" w:hAnsi="Times New Roman"/>
+          <w:sz w:val="24"/>
+          <w:szCs w:val="24"/>
+        </w:rPr>
+      </w:pPr>
+      <w:r>
+        <w:rPr>
+          <w:rFonts w:ascii="Times New Roman" w:cs="Times New Roman" w:eastAsia="Times New Roman" w:hAnsi="Times New Roman"/>
+          <w:sz w:val="24"/>
+          <w:szCs w:val="24"/>
+          <w:rtl w:val="0"/>
+        </w:rPr>
+        <w:t xml:space="preserve">Diseñar, implementar y evaluar experimentalmente un prototipo funcional de transmisión y recepción de información mediante luz infrarroja (invisible), en el que las pulsaciones de un control remoto se interpretan como </w:t>
       </w:r>
       <w:r>
         <w:rPr>
@@ -1139,549 +1134,13 @@
           <w:szCs w:val="24"/>
           <w:rtl w:val="0"/>
         </w:rPr>
-        <w:t xml:space="preserve"> a corta y media distancia en entornos controlados. </w:t>
-      </w:r>
-    </w:p>
-    <w:p>
-      <w:pPr>
-        <w:pBdr>
-          <w:top w:space="0" w:sz="0" w:val="nil"/>
-          <w:left w:space="0" w:sz="0" w:val="nil"/>
-          <w:bottom w:space="0" w:sz="0" w:val="nil"/>
-          <w:right w:space="0" w:sz="0" w:val="nil"/>
-          <w:between w:space="0" w:sz="0" w:val="nil"/>
-        </w:pBdr>
-        <w:shd w:fill="auto" w:val="clear"/>
-        <w:rPr>
-          <w:rFonts w:ascii="Impact" w:cs="Impact" w:eastAsia="Impact" w:hAnsi="Impact"/>
-          <w:sz w:val="24"/>
-          <w:szCs w:val="24"/>
-        </w:rPr>
-      </w:pPr>
-      <w:r>
-        <w:rPr>
-          <w:rtl w:val="0"/>
-        </w:rPr>
-      </w:r>
-    </w:p>
-    <w:p>
-      <w:pPr>
-        <w:pBdr>
-          <w:top w:space="0" w:sz="0" w:val="nil"/>
-          <w:left w:space="0" w:sz="0" w:val="nil"/>
-          <w:bottom w:space="0" w:sz="0" w:val="nil"/>
-          <w:right w:space="0" w:sz="0" w:val="nil"/>
-          <w:between w:space="0" w:sz="0" w:val="nil"/>
-        </w:pBdr>
-        <w:shd w:fill="auto" w:val="clear"/>
-        <w:spacing w:line="360" w:lineRule="auto"/>
-        <w:rPr>
-          <w:rFonts w:ascii="Impact" w:cs="Impact" w:eastAsia="Impact" w:hAnsi="Impact"/>
-          <w:sz w:val="24"/>
-          <w:szCs w:val="24"/>
-        </w:rPr>
-      </w:pPr>
-      <w:r>
-        <w:rPr>
-          <w:rFonts w:ascii="Impact" w:cs="Impact" w:eastAsia="Impact" w:hAnsi="Impact"/>
-          <w:sz w:val="24"/>
-          <w:szCs w:val="24"/>
-          <w:rtl w:val="0"/>
-        </w:rPr>
-        <w:t xml:space="preserve">3. Definiciones de Palabras Asociadas</w:t>
-      </w:r>
-    </w:p>
-    <w:p>
-      <w:pPr>
-        <w:spacing w:line="276" w:lineRule="auto"/>
-        <w:rPr>
-          <w:rFonts w:ascii="Times New Roman" w:cs="Times New Roman" w:eastAsia="Times New Roman" w:hAnsi="Times New Roman"/>
-          <w:sz w:val="24"/>
-          <w:szCs w:val="24"/>
-        </w:rPr>
-      </w:pPr>
-      <w:r>
-        <w:rPr>
-          <w:rFonts w:ascii="Times New Roman" w:cs="Times New Roman" w:eastAsia="Times New Roman" w:hAnsi="Times New Roman"/>
-          <w:sz w:val="24"/>
-          <w:szCs w:val="24"/>
-          <w:rtl w:val="0"/>
-        </w:rPr>
-        <w:t xml:space="preserve">Luz Invisible : Radiación electromagnética cuya longitud de onda es superior a la del espectro visible,imperceptible a la vista humana.</w:t>
-      </w:r>
-    </w:p>
-    <w:p>
-      <w:pPr>
-        <w:spacing w:line="276" w:lineRule="auto"/>
-        <w:rPr>
-          <w:rFonts w:ascii="Times New Roman" w:cs="Times New Roman" w:eastAsia="Times New Roman" w:hAnsi="Times New Roman"/>
-          <w:sz w:val="24"/>
-          <w:szCs w:val="24"/>
-        </w:rPr>
-      </w:pPr>
-      <w:r>
-        <w:rPr>
-          <w:rFonts w:ascii="Times New Roman" w:cs="Times New Roman" w:eastAsia="Times New Roman" w:hAnsi="Times New Roman"/>
-          <w:sz w:val="24"/>
-          <w:szCs w:val="24"/>
-          <w:rtl w:val="0"/>
-        </w:rPr>
-        <w:t xml:space="preserve">FSO: Tecnología de comunicación óptica inalámbrica que utiliza la propagación de la luz en el espacio libre para transmitir datos.</w:t>
-      </w:r>
-    </w:p>
-    <w:p>
-      <w:pPr>
-        <w:spacing w:line="276" w:lineRule="auto"/>
-        <w:rPr>
-          <w:rFonts w:ascii="Times New Roman" w:cs="Times New Roman" w:eastAsia="Times New Roman" w:hAnsi="Times New Roman"/>
-          <w:sz w:val="24"/>
-          <w:szCs w:val="24"/>
-        </w:rPr>
-      </w:pPr>
-      <w:r>
-        <w:rPr>
-          <w:rFonts w:ascii="Times New Roman" w:cs="Times New Roman" w:eastAsia="Times New Roman" w:hAnsi="Times New Roman"/>
-          <w:sz w:val="24"/>
-          <w:szCs w:val="24"/>
-          <w:rtl w:val="0"/>
-        </w:rPr>
-        <w:t xml:space="preserve">Diodo Láser : Fuente de luz coherente y altamente direccional que emite un haz monocromático en el espectro infrarrojo.</w:t>
-      </w:r>
-    </w:p>
-    <w:p>
-      <w:pPr>
-        <w:spacing w:line="276" w:lineRule="auto"/>
-        <w:rPr>
-          <w:rFonts w:ascii="Times New Roman" w:cs="Times New Roman" w:eastAsia="Times New Roman" w:hAnsi="Times New Roman"/>
-          <w:sz w:val="24"/>
-          <w:szCs w:val="24"/>
-        </w:rPr>
-      </w:pPr>
-      <w:r>
-        <w:rPr>
-          <w:rFonts w:ascii="Times New Roman" w:cs="Times New Roman" w:eastAsia="Times New Roman" w:hAnsi="Times New Roman"/>
-          <w:sz w:val="24"/>
-          <w:szCs w:val="24"/>
-          <w:rtl w:val="0"/>
-        </w:rPr>
-        <w:t xml:space="preserve">Código Morse: Sistema de representación de letras y números mediante señales intermitentes de duración variable (puntos </w:t>
-      </w:r>
-      <w:r>
-        <w:rPr>
-          <w:rFonts w:ascii="Times New Roman" w:cs="Times New Roman" w:eastAsia="Times New Roman" w:hAnsi="Times New Roman"/>
-          <w:color w:val="188038"/>
-          <w:sz w:val="24"/>
-          <w:szCs w:val="24"/>
-          <w:rtl w:val="0"/>
-        </w:rPr>
-        <w:t xml:space="preserve">.</w:t>
-      </w:r>
-      <w:r>
-        <w:rPr>
-          <w:rFonts w:ascii="Times New Roman" w:cs="Times New Roman" w:eastAsia="Times New Roman" w:hAnsi="Times New Roman"/>
-          <w:sz w:val="24"/>
-          <w:szCs w:val="24"/>
-          <w:rtl w:val="0"/>
-        </w:rPr>
-        <w:t xml:space="preserve"> y rayas </w:t>
-      </w:r>
-      <w:r>
-        <w:rPr>
-          <w:rFonts w:ascii="Times New Roman" w:cs="Times New Roman" w:eastAsia="Times New Roman" w:hAnsi="Times New Roman"/>
-          <w:color w:val="188038"/>
-          <w:sz w:val="24"/>
-          <w:szCs w:val="24"/>
-          <w:rtl w:val="0"/>
-        </w:rPr>
-        <w:t xml:space="preserve">-</w:t>
-      </w:r>
-      <w:r>
-        <w:rPr>
-          <w:rFonts w:ascii="Times New Roman" w:cs="Times New Roman" w:eastAsia="Times New Roman" w:hAnsi="Times New Roman"/>
-          <w:sz w:val="24"/>
-          <w:szCs w:val="24"/>
-          <w:rtl w:val="0"/>
-        </w:rPr>
-        <w:t xml:space="preserve">).</w:t>
-      </w:r>
-    </w:p>
-    <w:p>
-      <w:pPr>
-        <w:spacing w:line="276" w:lineRule="auto"/>
-        <w:rPr>
-          <w:rFonts w:ascii="Times New Roman" w:cs="Times New Roman" w:eastAsia="Times New Roman" w:hAnsi="Times New Roman"/>
-          <w:sz w:val="24"/>
-          <w:szCs w:val="24"/>
-        </w:rPr>
-      </w:pPr>
-      <w:r>
-        <w:rPr>
-          <w:rFonts w:ascii="Times New Roman" w:cs="Times New Roman" w:eastAsia="Times New Roman" w:hAnsi="Times New Roman"/>
-          <w:sz w:val="24"/>
-          <w:szCs w:val="24"/>
-          <w:rtl w:val="0"/>
-        </w:rPr>
-        <w:t xml:space="preserve">Modulación OOK: Técnica de modulación digital por desplazamiento de amplitud en la que la presencia de la señal luminosa representa un estado alto/pulso y su ausencia representa un estado bajo/espacio.</w:t>
-      </w:r>
-    </w:p>
-    <w:p>
-      <w:pPr>
-        <w:spacing w:line="276" w:lineRule="auto"/>
-        <w:rPr>
-          <w:rFonts w:ascii="Times New Roman" w:cs="Times New Roman" w:eastAsia="Times New Roman" w:hAnsi="Times New Roman"/>
-          <w:sz w:val="24"/>
-          <w:szCs w:val="24"/>
-        </w:rPr>
-      </w:pPr>
-      <w:r>
-        <w:rPr>
-          <w:rFonts w:ascii="Times New Roman" w:cs="Times New Roman" w:eastAsia="Times New Roman" w:hAnsi="Times New Roman"/>
-          <w:sz w:val="24"/>
-          <w:szCs w:val="24"/>
-          <w:rtl w:val="0"/>
-        </w:rPr>
-        <w:t xml:space="preserve">Relación Señal/Ruido: Proporción entre la intensidad de la señal del láser detectada y el nivel del ruido ambiental de fondo</w:t>
-      </w:r>
-    </w:p>
-    <w:p>
-      <w:pPr>
-        <w:pBdr>
-          <w:top w:space="0" w:sz="0" w:val="nil"/>
-          <w:left w:space="0" w:sz="0" w:val="nil"/>
-          <w:bottom w:space="0" w:sz="0" w:val="nil"/>
-          <w:right w:space="0" w:sz="0" w:val="nil"/>
-          <w:between w:space="0" w:sz="0" w:val="nil"/>
-        </w:pBdr>
-        <w:shd w:fill="auto" w:val="clear"/>
-        <w:rPr>
-          <w:rFonts w:ascii="Times New Roman" w:cs="Times New Roman" w:eastAsia="Times New Roman" w:hAnsi="Times New Roman"/>
-          <w:sz w:val="24"/>
-          <w:szCs w:val="24"/>
-        </w:rPr>
-      </w:pPr>
-      <w:r>
-        <w:rPr>
-          <w:rtl w:val="0"/>
-        </w:rPr>
-      </w:r>
-    </w:p>
-    <w:p>
-      <w:pPr>
-        <w:pBdr>
-          <w:top w:space="0" w:sz="0" w:val="nil"/>
-          <w:left w:space="0" w:sz="0" w:val="nil"/>
-          <w:bottom w:space="0" w:sz="0" w:val="nil"/>
-          <w:right w:space="0" w:sz="0" w:val="nil"/>
-          <w:between w:space="0" w:sz="0" w:val="nil"/>
-        </w:pBdr>
-        <w:shd w:fill="auto" w:val="clear"/>
-        <w:spacing w:line="360" w:lineRule="auto"/>
-        <w:rPr>
-          <w:rFonts w:ascii="Impact" w:cs="Impact" w:eastAsia="Impact" w:hAnsi="Impact"/>
-          <w:sz w:val="24"/>
-          <w:szCs w:val="24"/>
-        </w:rPr>
-      </w:pPr>
-      <w:r>
-        <w:rPr>
-          <w:rFonts w:ascii="Impact" w:cs="Impact" w:eastAsia="Impact" w:hAnsi="Impact"/>
-          <w:sz w:val="24"/>
-          <w:szCs w:val="24"/>
-          <w:rtl w:val="0"/>
-        </w:rPr>
-        <w:t xml:space="preserve">4. Antecedentes de Investigación</w:t>
-      </w:r>
-    </w:p>
-    <w:p>
-      <w:pPr>
-        <w:pBdr>
-          <w:top w:space="0" w:sz="0" w:val="nil"/>
-          <w:left w:space="0" w:sz="0" w:val="nil"/>
-          <w:bottom w:space="0" w:sz="0" w:val="nil"/>
-          <w:right w:space="0" w:sz="0" w:val="nil"/>
-          <w:between w:space="0" w:sz="0" w:val="nil"/>
-        </w:pBdr>
-        <w:shd w:fill="auto" w:val="clear"/>
-        <w:spacing w:line="360" w:lineRule="auto"/>
-        <w:rPr>
-          <w:rFonts w:ascii="Times New Roman" w:cs="Times New Roman" w:eastAsia="Times New Roman" w:hAnsi="Times New Roman"/>
-          <w:sz w:val="24"/>
-          <w:szCs w:val="24"/>
-        </w:rPr>
-      </w:pPr>
-      <w:r>
-        <w:rPr>
-          <w:rFonts w:ascii="Times New Roman" w:cs="Times New Roman" w:eastAsia="Times New Roman" w:hAnsi="Times New Roman"/>
-          <w:sz w:val="24"/>
-          <w:szCs w:val="24"/>
-          <w:rtl w:val="0"/>
-        </w:rPr>
-        <w:t xml:space="preserve">- Gómez, M., &amp; Rodríguez, F. (2023). Análisis de rendimiento de sistemas Li-Fi en entornos interiores con interferencia de luz ambiental. Revista Iberoamericana de Telecomunicaciones, 15(2), 45-58.</w:t>
-      </w:r>
-    </w:p>
-    <w:p>
-      <w:pPr>
-        <w:pBdr>
-          <w:top w:space="0" w:sz="0" w:val="nil"/>
-          <w:left w:space="0" w:sz="0" w:val="nil"/>
-          <w:bottom w:space="0" w:sz="0" w:val="nil"/>
-          <w:right w:space="0" w:sz="0" w:val="nil"/>
-          <w:between w:space="0" w:sz="0" w:val="nil"/>
-        </w:pBdr>
-        <w:shd w:fill="auto" w:val="clear"/>
-        <w:spacing w:line="360" w:lineRule="auto"/>
-        <w:rPr>
-          <w:rFonts w:ascii="Times New Roman" w:cs="Times New Roman" w:eastAsia="Times New Roman" w:hAnsi="Times New Roman"/>
-          <w:sz w:val="24"/>
-          <w:szCs w:val="24"/>
-        </w:rPr>
-      </w:pPr>
-      <w:r>
-        <w:rPr>
-          <w:rFonts w:ascii="Times New Roman" w:cs="Times New Roman" w:eastAsia="Times New Roman" w:hAnsi="Times New Roman"/>
-          <w:sz w:val="24"/>
-          <w:szCs w:val="24"/>
-          <w:rtl w:val="0"/>
-        </w:rPr>
-        <w:t xml:space="preserve">- Haas, H., &amp; Chen, C. (2022). Advances in high-speed visible light communication using micro-LED arrays. IEEE Transactions on Wireless Communications, 21(8), 6102-6115.</w:t>
-      </w:r>
-    </w:p>
-    <w:p>
-      <w:pPr>
-        <w:pBdr>
-          <w:top w:space="0" w:sz="0" w:val="nil"/>
-          <w:left w:space="0" w:sz="0" w:val="nil"/>
-          <w:bottom w:space="0" w:sz="0" w:val="nil"/>
-          <w:right w:space="0" w:sz="0" w:val="nil"/>
-          <w:between w:space="0" w:sz="0" w:val="nil"/>
-        </w:pBdr>
-        <w:shd w:fill="auto" w:val="clear"/>
-        <w:spacing w:line="360" w:lineRule="auto"/>
-        <w:rPr>
-          <w:rFonts w:ascii="Times New Roman" w:cs="Times New Roman" w:eastAsia="Times New Roman" w:hAnsi="Times New Roman"/>
-          <w:sz w:val="24"/>
-          <w:szCs w:val="24"/>
-        </w:rPr>
-      </w:pPr>
-      <w:r>
-        <w:rPr>
-          <w:rFonts w:ascii="Times New Roman" w:cs="Times New Roman" w:eastAsia="Times New Roman" w:hAnsi="Times New Roman"/>
-          <w:sz w:val="24"/>
-          <w:szCs w:val="24"/>
-          <w:rtl w:val="0"/>
-        </w:rPr>
-        <w:t xml:space="preserve">- Martínez, J., López, E., &amp; Torres, R. (2024). Prototipado de bajo costo para transmisión de audio analógico mediante comunicación por luz visible. Journal of Applied Optics and Electronics, 9(1), 12-24.</w:t>
-      </w:r>
-    </w:p>
-    <w:p>
-      <w:pPr>
-        <w:pBdr>
-          <w:top w:space="0" w:sz="0" w:val="nil"/>
-          <w:left w:space="0" w:sz="0" w:val="nil"/>
-          <w:bottom w:space="0" w:sz="0" w:val="nil"/>
-          <w:right w:space="0" w:sz="0" w:val="nil"/>
-          <w:between w:space="0" w:sz="0" w:val="nil"/>
-        </w:pBdr>
-        <w:shd w:fill="auto" w:val="clear"/>
-        <w:spacing w:line="360" w:lineRule="auto"/>
-        <w:rPr>
-          <w:rFonts w:ascii="Impact" w:cs="Impact" w:eastAsia="Impact" w:hAnsi="Impact"/>
-          <w:sz w:val="24"/>
-          <w:szCs w:val="24"/>
-        </w:rPr>
-      </w:pPr>
-      <w:r>
-        <w:rPr>
-          <w:rFonts w:ascii="Impact" w:cs="Impact" w:eastAsia="Impact" w:hAnsi="Impact"/>
-          <w:sz w:val="24"/>
-          <w:szCs w:val="24"/>
-          <w:rtl w:val="0"/>
-        </w:rPr>
-        <w:t xml:space="preserve">5. Materiales</w:t>
-      </w:r>
-    </w:p>
-    <w:p>
-      <w:pPr>
-        <w:pBdr>
-          <w:top w:space="0" w:sz="0" w:val="nil"/>
-          <w:left w:space="0" w:sz="0" w:val="nil"/>
-          <w:bottom w:space="0" w:sz="0" w:val="nil"/>
-          <w:right w:space="0" w:sz="0" w:val="nil"/>
-          <w:between w:space="0" w:sz="0" w:val="nil"/>
-        </w:pBdr>
-        <w:shd w:fill="auto" w:val="clear"/>
-        <w:rPr>
-          <w:rFonts w:ascii="Times New Roman" w:cs="Times New Roman" w:eastAsia="Times New Roman" w:hAnsi="Times New Roman"/>
-          <w:sz w:val="24"/>
-          <w:szCs w:val="24"/>
-        </w:rPr>
-      </w:pPr>
-      <w:r>
-        <w:rPr>
-          <w:rFonts w:ascii="Times New Roman" w:cs="Times New Roman" w:eastAsia="Times New Roman" w:hAnsi="Times New Roman"/>
-          <w:sz w:val="24"/>
-          <w:szCs w:val="24"/>
-          <w:rtl w:val="0"/>
-        </w:rPr>
-        <w:t xml:space="preserve">Emisor Óptico: Diodo Láser Infrarrojo  y Receptor Óptico: Fotodiodo PIN Infrarrojo o Fototransistor </w:t>
-      </w:r>
-    </w:p>
-    <w:p>
-      <w:pPr>
-        <w:pBdr>
-          <w:top w:space="0" w:sz="0" w:val="nil"/>
-          <w:left w:space="0" w:sz="0" w:val="nil"/>
-          <w:bottom w:space="0" w:sz="0" w:val="nil"/>
-          <w:right w:space="0" w:sz="0" w:val="nil"/>
-          <w:between w:space="0" w:sz="0" w:val="nil"/>
-        </w:pBdr>
-        <w:shd w:fill="auto" w:val="clear"/>
-        <w:rPr>
-          <w:sz w:val="24"/>
-          <w:szCs w:val="24"/>
-        </w:rPr>
-      </w:pPr>
-      <w:r>
-        <w:rPr>
-          <w:sz w:val="24"/>
-          <w:szCs w:val="24"/>
-        </w:rPr>
-        <w:drawing>
-          <wp:inline distB="114300" distT="114300" distL="114300" distR="114300">
-            <wp:extent cx="3419475" cy="2990850"/>
-            <wp:effectExtent b="0" l="0" r="0" t="0"/>
-            <wp:docPr id="2" name="image2.png"/>
-            <a:graphic>
-              <a:graphicData uri="http://schemas.openxmlformats.org/drawingml/2006/picture">
-                <pic:pic>
-                  <pic:nvPicPr>
-                    <pic:cNvPr id="0" name="image2.png"/>
-                    <pic:cNvPicPr preferRelativeResize="0"/>
-                  </pic:nvPicPr>
-                  <pic:blipFill>
-                    <a:blip r:embed="rId8"/>
-                    <a:srcRect b="0" l="0" r="0" t="0"/>
-                    <a:stretch>
-                      <a:fillRect/>
-                    </a:stretch>
-                  </pic:blipFill>
-                  <pic:spPr>
-                    <a:xfrm>
-                      <a:off x="0" y="0"/>
-                      <a:ext cx="3419475" cy="2990850"/>
-                    </a:xfrm>
-                    <a:prstGeom prst="rect"/>
-                    <a:ln/>
-                  </pic:spPr>
-                </pic:pic>
-              </a:graphicData>
-            </a:graphic>
-          </wp:inline>
-        </w:drawing>
-      </w:r>
-      <w:r>
-        <w:rPr>
-          <w:rtl w:val="0"/>
-        </w:rPr>
-      </w:r>
-    </w:p>
-    <w:p>
-      <w:pPr>
-        <w:pBdr>
-          <w:top w:space="0" w:sz="0" w:val="nil"/>
-          <w:left w:space="0" w:sz="0" w:val="nil"/>
-          <w:bottom w:space="0" w:sz="0" w:val="nil"/>
-          <w:right w:space="0" w:sz="0" w:val="nil"/>
-          <w:between w:space="0" w:sz="0" w:val="nil"/>
-        </w:pBdr>
-        <w:shd w:fill="auto" w:val="clear"/>
-        <w:rPr>
-          <w:rFonts w:ascii="Times New Roman" w:cs="Times New Roman" w:eastAsia="Times New Roman" w:hAnsi="Times New Roman"/>
-          <w:sz w:val="24"/>
-          <w:szCs w:val="24"/>
-        </w:rPr>
-      </w:pPr>
-      <w:r>
-        <w:rPr>
-          <w:rFonts w:ascii="Times New Roman" w:cs="Times New Roman" w:eastAsia="Times New Roman" w:hAnsi="Times New Roman"/>
-          <w:sz w:val="24"/>
-          <w:szCs w:val="24"/>
-          <w:rtl w:val="0"/>
-        </w:rPr>
-        <w:t xml:space="preserve">Filtro Óptico:Filtro óptico receptor para el bloqueo de luz del espectro visible </w:t>
-      </w:r>
-    </w:p>
-    <w:p>
-      <w:pPr>
-        <w:pBdr>
-          <w:top w:space="0" w:sz="0" w:val="nil"/>
-          <w:left w:space="0" w:sz="0" w:val="nil"/>
-          <w:bottom w:space="0" w:sz="0" w:val="nil"/>
-          <w:right w:space="0" w:sz="0" w:val="nil"/>
-          <w:between w:space="0" w:sz="0" w:val="nil"/>
-        </w:pBdr>
-        <w:shd w:fill="auto" w:val="clear"/>
-        <w:rPr>
-          <w:rFonts w:ascii="Times New Roman" w:cs="Times New Roman" w:eastAsia="Times New Roman" w:hAnsi="Times New Roman"/>
-          <w:sz w:val="24"/>
-          <w:szCs w:val="24"/>
-        </w:rPr>
-      </w:pPr>
-      <w:r>
-        <w:rPr>
-          <w:rFonts w:ascii="Times New Roman" w:cs="Times New Roman" w:eastAsia="Times New Roman" w:hAnsi="Times New Roman"/>
-          <w:sz w:val="24"/>
-          <w:szCs w:val="24"/>
-        </w:rPr>
-        <w:drawing>
-          <wp:inline distB="114300" distT="114300" distL="114300" distR="114300">
-            <wp:extent cx="2205038" cy="1786080"/>
-            <wp:effectExtent b="0" l="0" r="0" t="0"/>
-            <wp:docPr id="6" name="image5.png"/>
-            <a:graphic>
-              <a:graphicData uri="http://schemas.openxmlformats.org/drawingml/2006/picture">
-                <pic:pic>
-                  <pic:nvPicPr>
-                    <pic:cNvPr id="0" name="image5.png"/>
-                    <pic:cNvPicPr preferRelativeResize="0"/>
-                  </pic:nvPicPr>
-                  <pic:blipFill>
-                    <a:blip r:embed="rId9"/>
-                    <a:srcRect b="0" l="0" r="0" t="0"/>
-                    <a:stretch>
-                      <a:fillRect/>
-                    </a:stretch>
-                  </pic:blipFill>
-                  <pic:spPr>
-                    <a:xfrm>
-                      <a:off x="0" y="0"/>
-                      <a:ext cx="2205038" cy="1786080"/>
-                    </a:xfrm>
-                    <a:prstGeom prst="rect"/>
-                    <a:ln/>
-                  </pic:spPr>
-                </pic:pic>
-              </a:graphicData>
-            </a:graphic>
-          </wp:inline>
-        </w:drawing>
-      </w:r>
-      <w:r>
-        <w:rPr>
-          <w:rtl w:val="0"/>
-        </w:rPr>
-      </w:r>
-    </w:p>
-    <w:p>
-      <w:pPr>
-        <w:pBdr>
-          <w:top w:space="0" w:sz="0" w:val="nil"/>
-          <w:left w:space="0" w:sz="0" w:val="nil"/>
-          <w:bottom w:space="0" w:sz="0" w:val="nil"/>
-          <w:right w:space="0" w:sz="0" w:val="nil"/>
-          <w:between w:space="0" w:sz="0" w:val="nil"/>
-        </w:pBdr>
-        <w:shd w:fill="auto" w:val="clear"/>
+        <w:t xml:space="preserve"> y el mensaje decodificado se visualiza en una pantalla LCD, determinando su precisión, alcance y robustez frente a la luz ambiental en entornos controlados.</w:t>
+      </w:r>
+    </w:p>
+    <w:p>
+      <w:pPr>
+        <w:spacing w:line="360" w:lineRule="auto"/>
+        <w:jc w:val="both"/>
         <w:rPr>
           <w:rFonts w:ascii="Times New Roman" w:cs="Times New Roman" w:eastAsia="Times New Roman" w:hAnsi="Times New Roman"/>
           <w:sz w:val="24"/>
@@ -1697,16 +1156,829 @@
           <w:szCs w:val="24"/>
           <w:rtl w:val="0"/>
         </w:rPr>
-        <w:t xml:space="preserve">Control y Procesamiento:</w:t>
-      </w:r>
-      <w:r>
-        <w:rPr>
-          <w:rFonts w:ascii="Times New Roman" w:cs="Times New Roman" w:eastAsia="Times New Roman" w:hAnsi="Times New Roman"/>
-          <w:sz w:val="24"/>
-          <w:szCs w:val="24"/>
-          <w:rtl w:val="0"/>
-        </w:rPr>
-        <w:t xml:space="preserve"> Microcontrolador:</w:t>
+        <w:t xml:space="preserve">Objetivos específicos</w:t>
+      </w:r>
+    </w:p>
+    <w:p>
+      <w:pPr>
+        <w:spacing w:line="360" w:lineRule="auto"/>
+        <w:jc w:val="both"/>
+        <w:rPr>
+          <w:rFonts w:ascii="Times New Roman" w:cs="Times New Roman" w:eastAsia="Times New Roman" w:hAnsi="Times New Roman"/>
+          <w:sz w:val="24"/>
+          <w:szCs w:val="24"/>
+        </w:rPr>
+      </w:pPr>
+      <w:r>
+        <w:rPr>
+          <w:rFonts w:ascii="Times New Roman" w:cs="Times New Roman" w:eastAsia="Times New Roman" w:hAnsi="Times New Roman"/>
+          <w:sz w:val="24"/>
+          <w:szCs w:val="24"/>
+          <w:rtl w:val="0"/>
+        </w:rPr>
+        <w:t xml:space="preserve">- Implementar en Arduino la detección de la señal infrarroja y la medición de la duración de cada pulsación del control remoto.</w:t>
+      </w:r>
+    </w:p>
+    <w:p>
+      <w:pPr>
+        <w:spacing w:line="360" w:lineRule="auto"/>
+        <w:jc w:val="both"/>
+        <w:rPr>
+          <w:rFonts w:ascii="Times New Roman" w:cs="Times New Roman" w:eastAsia="Times New Roman" w:hAnsi="Times New Roman"/>
+          <w:sz w:val="24"/>
+          <w:szCs w:val="24"/>
+        </w:rPr>
+      </w:pPr>
+      <w:r>
+        <w:rPr>
+          <w:rFonts w:ascii="Times New Roman" w:cs="Times New Roman" w:eastAsia="Times New Roman" w:hAnsi="Times New Roman"/>
+          <w:sz w:val="24"/>
+          <w:szCs w:val="24"/>
+          <w:rtl w:val="0"/>
+        </w:rPr>
+        <w:t xml:space="preserve">- Clasificar las pulsaciones en puntos y rayas y decodificar letras, números y signos del código Morse internacional.</w:t>
+      </w:r>
+    </w:p>
+    <w:p>
+      <w:pPr>
+        <w:spacing w:line="360" w:lineRule="auto"/>
+        <w:jc w:val="both"/>
+        <w:rPr>
+          <w:rFonts w:ascii="Times New Roman" w:cs="Times New Roman" w:eastAsia="Times New Roman" w:hAnsi="Times New Roman"/>
+          <w:sz w:val="24"/>
+          <w:szCs w:val="24"/>
+        </w:rPr>
+      </w:pPr>
+      <w:r>
+        <w:rPr>
+          <w:rFonts w:ascii="Times New Roman" w:cs="Times New Roman" w:eastAsia="Times New Roman" w:hAnsi="Times New Roman"/>
+          <w:sz w:val="24"/>
+          <w:szCs w:val="24"/>
+          <w:rtl w:val="0"/>
+        </w:rPr>
+        <w:t xml:space="preserve">- Mostrar en tiempo real el mensaje decodificado en una pantalla LCD 16x2.</w:t>
+      </w:r>
+    </w:p>
+    <w:p>
+      <w:pPr>
+        <w:spacing w:line="360" w:lineRule="auto"/>
+        <w:jc w:val="both"/>
+        <w:rPr>
+          <w:rFonts w:ascii="Times New Roman" w:cs="Times New Roman" w:eastAsia="Times New Roman" w:hAnsi="Times New Roman"/>
+          <w:sz w:val="24"/>
+          <w:szCs w:val="24"/>
+        </w:rPr>
+      </w:pPr>
+      <w:r>
+        <w:rPr>
+          <w:rFonts w:ascii="Times New Roman" w:cs="Times New Roman" w:eastAsia="Times New Roman" w:hAnsi="Times New Roman"/>
+          <w:sz w:val="24"/>
+          <w:szCs w:val="24"/>
+          <w:rtl w:val="0"/>
+        </w:rPr>
+        <w:t xml:space="preserve">- Medir la tasa de acierto, el alcance máximo, el ángulo de recepción y el efecto de la luz ambiental sobre el sistema.</w:t>
+      </w:r>
+    </w:p>
+    <w:p>
+      <w:pPr>
+        <w:pBdr>
+          <w:top w:space="0" w:sz="0" w:val="nil"/>
+          <w:left w:space="0" w:sz="0" w:val="nil"/>
+          <w:bottom w:space="0" w:sz="0" w:val="nil"/>
+          <w:right w:space="0" w:sz="0" w:val="nil"/>
+          <w:between w:space="0" w:sz="0" w:val="nil"/>
+        </w:pBdr>
+        <w:shd w:fill="auto" w:val="clear"/>
+        <w:rPr>
+          <w:rFonts w:ascii="Times New Roman" w:cs="Times New Roman" w:eastAsia="Times New Roman" w:hAnsi="Times New Roman"/>
+          <w:sz w:val="24"/>
+          <w:szCs w:val="24"/>
+        </w:rPr>
+      </w:pPr>
+      <w:r>
+        <w:rPr>
+          <w:rtl w:val="0"/>
+        </w:rPr>
+      </w:r>
+    </w:p>
+    <w:p>
+      <w:pPr>
+        <w:pBdr>
+          <w:top w:space="0" w:sz="0" w:val="nil"/>
+          <w:left w:space="0" w:sz="0" w:val="nil"/>
+          <w:bottom w:space="0" w:sz="0" w:val="nil"/>
+          <w:right w:space="0" w:sz="0" w:val="nil"/>
+          <w:between w:space="0" w:sz="0" w:val="nil"/>
+        </w:pBdr>
+        <w:shd w:fill="auto" w:val="clear"/>
+        <w:spacing w:line="360" w:lineRule="auto"/>
+        <w:rPr>
+          <w:rFonts w:ascii="Impact" w:cs="Impact" w:eastAsia="Impact" w:hAnsi="Impact"/>
+          <w:sz w:val="24"/>
+          <w:szCs w:val="24"/>
+        </w:rPr>
+      </w:pPr>
+      <w:r>
+        <w:rPr>
+          <w:rFonts w:ascii="Impact" w:cs="Impact" w:eastAsia="Impact" w:hAnsi="Impact"/>
+          <w:sz w:val="24"/>
+          <w:szCs w:val="24"/>
+          <w:rtl w:val="0"/>
+        </w:rPr>
+        <w:t xml:space="preserve">3. Definiciones de Palabras Asociadas</w:t>
+      </w:r>
+    </w:p>
+    <w:p>
+      <w:pPr>
+        <w:spacing w:line="276" w:lineRule="auto"/>
+        <w:jc w:val="both"/>
+        <w:rPr>
+          <w:rFonts w:ascii="Times New Roman" w:cs="Times New Roman" w:eastAsia="Times New Roman" w:hAnsi="Times New Roman"/>
+          <w:sz w:val="24"/>
+          <w:szCs w:val="24"/>
+        </w:rPr>
+      </w:pPr>
+      <w:r>
+        <w:rPr>
+          <w:rFonts w:ascii="Times New Roman" w:cs="Times New Roman" w:eastAsia="Times New Roman" w:hAnsi="Times New Roman"/>
+          <w:b w:val="1"/>
+          <w:bCs w:val="1"/>
+          <w:sz w:val="24"/>
+          <w:szCs w:val="24"/>
+          <w:rtl w:val="0"/>
+        </w:rPr>
+        <w:t xml:space="preserve">Luz invisible (radiación infrarroja): </w:t>
+      </w:r>
+      <w:r>
+        <w:rPr>
+          <w:rFonts w:ascii="Times New Roman" w:cs="Times New Roman" w:eastAsia="Times New Roman" w:hAnsi="Times New Roman"/>
+          <w:sz w:val="24"/>
+          <w:szCs w:val="24"/>
+          <w:rtl w:val="0"/>
+        </w:rPr>
+        <w:t xml:space="preserve">Radiación electromagnética cuya longitud de onda es mayor que la del espectro visible (aproximadamente de 700 nm a 1 mm), imperceptible para el ojo humano. Los controles remotos emiten normalmente en torno a 940 nm.</w:t>
+      </w:r>
+    </w:p>
+    <w:p>
+      <w:pPr>
+        <w:spacing w:line="276" w:lineRule="auto"/>
+        <w:jc w:val="both"/>
+        <w:rPr>
+          <w:rFonts w:ascii="Times New Roman" w:cs="Times New Roman" w:eastAsia="Times New Roman" w:hAnsi="Times New Roman"/>
+          <w:sz w:val="24"/>
+          <w:szCs w:val="24"/>
+        </w:rPr>
+      </w:pPr>
+      <w:r>
+        <w:rPr>
+          <w:rFonts w:ascii="Times New Roman" w:cs="Times New Roman" w:eastAsia="Times New Roman" w:hAnsi="Times New Roman"/>
+          <w:b w:val="1"/>
+          <w:bCs w:val="1"/>
+          <w:sz w:val="24"/>
+          <w:szCs w:val="24"/>
+          <w:rtl w:val="0"/>
+        </w:rPr>
+        <w:t xml:space="preserve">LED infrarrojo: </w:t>
+      </w:r>
+      <w:r>
+        <w:rPr>
+          <w:rFonts w:ascii="Times New Roman" w:cs="Times New Roman" w:eastAsia="Times New Roman" w:hAnsi="Times New Roman"/>
+          <w:sz w:val="24"/>
+          <w:szCs w:val="24"/>
+          <w:rtl w:val="0"/>
+        </w:rPr>
+        <w:t xml:space="preserve">Diodo emisor de luz que emite radiación infrarroja. Es la fuente óptica del control remoto.</w:t>
+      </w:r>
+    </w:p>
+    <w:p>
+      <w:pPr>
+        <w:spacing w:line="276" w:lineRule="auto"/>
+        <w:jc w:val="both"/>
+        <w:rPr>
+          <w:rFonts w:ascii="Times New Roman" w:cs="Times New Roman" w:eastAsia="Times New Roman" w:hAnsi="Times New Roman"/>
+          <w:sz w:val="24"/>
+          <w:szCs w:val="24"/>
+        </w:rPr>
+      </w:pPr>
+      <w:r>
+        <w:rPr>
+          <w:rFonts w:ascii="Times New Roman" w:cs="Times New Roman" w:eastAsia="Times New Roman" w:hAnsi="Times New Roman"/>
+          <w:b w:val="1"/>
+          <w:bCs w:val="1"/>
+          <w:sz w:val="24"/>
+          <w:szCs w:val="24"/>
+          <w:rtl w:val="0"/>
+        </w:rPr>
+        <w:t xml:space="preserve">Control remoto infrarrojo: </w:t>
+      </w:r>
+      <w:r>
+        <w:rPr>
+          <w:rFonts w:ascii="Times New Roman" w:cs="Times New Roman" w:eastAsia="Times New Roman" w:hAnsi="Times New Roman"/>
+          <w:sz w:val="24"/>
+          <w:szCs w:val="24"/>
+          <w:rtl w:val="0"/>
+        </w:rPr>
+        <w:t xml:space="preserve">Dispositivo que codifica la pulsación de cada botón como una trama digital (por ejemplo, con el protocolo NEC) y la transmite mediante destellos de un LED infrarrojo.</w:t>
+      </w:r>
+    </w:p>
+    <w:p>
+      <w:pPr>
+        <w:spacing w:line="276" w:lineRule="auto"/>
+        <w:jc w:val="both"/>
+        <w:rPr>
+          <w:rFonts w:ascii="Times New Roman" w:cs="Times New Roman" w:eastAsia="Times New Roman" w:hAnsi="Times New Roman"/>
+          <w:sz w:val="24"/>
+          <w:szCs w:val="24"/>
+        </w:rPr>
+      </w:pPr>
+      <w:r>
+        <w:rPr>
+          <w:rFonts w:ascii="Times New Roman" w:cs="Times New Roman" w:eastAsia="Times New Roman" w:hAnsi="Times New Roman"/>
+          <w:b w:val="1"/>
+          <w:bCs w:val="1"/>
+          <w:sz w:val="24"/>
+          <w:szCs w:val="24"/>
+          <w:rtl w:val="0"/>
+        </w:rPr>
+        <w:t xml:space="preserve">Portadora de 38 kHz: </w:t>
+      </w:r>
+      <w:r>
+        <w:rPr>
+          <w:rFonts w:ascii="Times New Roman" w:cs="Times New Roman" w:eastAsia="Times New Roman" w:hAnsi="Times New Roman"/>
+          <w:sz w:val="24"/>
+          <w:szCs w:val="24"/>
+          <w:rtl w:val="0"/>
+        </w:rPr>
+        <w:t xml:space="preserve">Señal periódica de alta frecuencia sobre la que se modula la información. Durante cada ráfaga, el LED se enciende y apaga 38.000 veces por segundo, lo que permite distinguir la señal útil de la luz ambiental.</w:t>
+      </w:r>
+    </w:p>
+    <w:p>
+      <w:pPr>
+        <w:spacing w:line="276" w:lineRule="auto"/>
+        <w:jc w:val="both"/>
+        <w:rPr>
+          <w:rFonts w:ascii="Times New Roman" w:cs="Times New Roman" w:eastAsia="Times New Roman" w:hAnsi="Times New Roman"/>
+          <w:sz w:val="24"/>
+          <w:szCs w:val="24"/>
+        </w:rPr>
+      </w:pPr>
+      <w:r>
+        <w:rPr>
+          <w:rFonts w:ascii="Times New Roman" w:cs="Times New Roman" w:eastAsia="Times New Roman" w:hAnsi="Times New Roman"/>
+          <w:b w:val="1"/>
+          <w:bCs w:val="1"/>
+          <w:sz w:val="24"/>
+          <w:szCs w:val="24"/>
+          <w:rtl w:val="0"/>
+        </w:rPr>
+        <w:t xml:space="preserve">Receptor IR (VS1838B / TSOP1838): </w:t>
+      </w:r>
+      <w:r>
+        <w:rPr>
+          <w:rFonts w:ascii="Times New Roman" w:cs="Times New Roman" w:eastAsia="Times New Roman" w:hAnsi="Times New Roman"/>
+          <w:sz w:val="24"/>
+          <w:szCs w:val="24"/>
+          <w:rtl w:val="0"/>
+        </w:rPr>
+        <w:t xml:space="preserve">Módulo que integra un fotodiodo, un amplificador, un filtro pasabanda centrado en 38 kHz y un demodulador. Entrega una señal digital que indica la presencia o ausencia de la portadora.</w:t>
+      </w:r>
+    </w:p>
+    <w:p>
+      <w:pPr>
+        <w:spacing w:line="276" w:lineRule="auto"/>
+        <w:jc w:val="both"/>
+        <w:rPr>
+          <w:rFonts w:ascii="Times New Roman" w:cs="Times New Roman" w:eastAsia="Times New Roman" w:hAnsi="Times New Roman"/>
+          <w:sz w:val="24"/>
+          <w:szCs w:val="24"/>
+        </w:rPr>
+      </w:pPr>
+      <w:r>
+        <w:rPr>
+          <w:rFonts w:ascii="Times New Roman" w:cs="Times New Roman" w:eastAsia="Times New Roman" w:hAnsi="Times New Roman"/>
+          <w:b w:val="1"/>
+          <w:bCs w:val="1"/>
+          <w:sz w:val="24"/>
+          <w:szCs w:val="24"/>
+          <w:rtl w:val="0"/>
+        </w:rPr>
+        <w:t xml:space="preserve">Protocolo NEC: </w:t>
+      </w:r>
+      <w:r>
+        <w:rPr>
+          <w:rFonts w:ascii="Times New Roman" w:cs="Times New Roman" w:eastAsia="Times New Roman" w:hAnsi="Times New Roman"/>
+          <w:sz w:val="24"/>
+          <w:szCs w:val="24"/>
+          <w:rtl w:val="0"/>
+        </w:rPr>
+        <w:t xml:space="preserve">Protocolo de control remoto en el que cada pulsación genera una trama de 32 bits (dirección y comando). Mientras el botón se mantiene presionado, se envía un código de repetición aproximadamente cada 110 ms.</w:t>
+      </w:r>
+    </w:p>
+    <w:p>
+      <w:pPr>
+        <w:spacing w:line="276" w:lineRule="auto"/>
+        <w:jc w:val="both"/>
+        <w:rPr>
+          <w:rFonts w:ascii="Times New Roman" w:cs="Times New Roman" w:eastAsia="Times New Roman" w:hAnsi="Times New Roman"/>
+          <w:sz w:val="24"/>
+          <w:szCs w:val="24"/>
+        </w:rPr>
+      </w:pPr>
+      <w:r>
+        <w:rPr>
+          <w:rFonts w:ascii="Times New Roman" w:cs="Times New Roman" w:eastAsia="Times New Roman" w:hAnsi="Times New Roman"/>
+          <w:b w:val="1"/>
+          <w:bCs w:val="1"/>
+          <w:sz w:val="24"/>
+          <w:szCs w:val="24"/>
+          <w:rtl w:val="0"/>
+        </w:rPr>
+        <w:t xml:space="preserve">Código Morse: </w:t>
+      </w:r>
+      <w:r>
+        <w:rPr>
+          <w:rFonts w:ascii="Times New Roman" w:cs="Times New Roman" w:eastAsia="Times New Roman" w:hAnsi="Times New Roman"/>
+          <w:sz w:val="24"/>
+          <w:szCs w:val="24"/>
+          <w:rtl w:val="0"/>
+        </w:rPr>
+        <w:t xml:space="preserve">Sistema de representación de letras y números mediante señales intermitentes de duración variable: puntos (.) y rayas (-).</w:t>
+      </w:r>
+    </w:p>
+    <w:p>
+      <w:pPr>
+        <w:spacing w:line="276" w:lineRule="auto"/>
+        <w:jc w:val="both"/>
+        <w:rPr>
+          <w:rFonts w:ascii="Times New Roman" w:cs="Times New Roman" w:eastAsia="Times New Roman" w:hAnsi="Times New Roman"/>
+          <w:sz w:val="24"/>
+          <w:szCs w:val="24"/>
+        </w:rPr>
+      </w:pPr>
+      <w:r>
+        <w:rPr>
+          <w:rFonts w:ascii="Times New Roman" w:cs="Times New Roman" w:eastAsia="Times New Roman" w:hAnsi="Times New Roman"/>
+          <w:b w:val="1"/>
+          <w:bCs w:val="1"/>
+          <w:sz w:val="24"/>
+          <w:szCs w:val="24"/>
+          <w:rtl w:val="0"/>
+        </w:rPr>
+        <w:t xml:space="preserve">Modulación OOK: </w:t>
+      </w:r>
+      <w:r>
+        <w:rPr>
+          <w:rFonts w:ascii="Times New Roman" w:cs="Times New Roman" w:eastAsia="Times New Roman" w:hAnsi="Times New Roman"/>
+          <w:sz w:val="24"/>
+          <w:szCs w:val="24"/>
+          <w:rtl w:val="0"/>
+        </w:rPr>
+        <w:t xml:space="preserve">Técnica de modulación digital por desplazamiento de amplitud en la que la presencia de la señal representa un estado alto (pulso) y su ausencia un estado bajo (espacio).</w:t>
+      </w:r>
+    </w:p>
+    <w:p>
+      <w:pPr>
+        <w:spacing w:line="276" w:lineRule="auto"/>
+        <w:jc w:val="both"/>
+        <w:rPr>
+          <w:rFonts w:ascii="Times New Roman" w:cs="Times New Roman" w:eastAsia="Times New Roman" w:hAnsi="Times New Roman"/>
+          <w:sz w:val="24"/>
+          <w:szCs w:val="24"/>
+        </w:rPr>
+      </w:pPr>
+      <w:r>
+        <w:rPr>
+          <w:rFonts w:ascii="Times New Roman" w:cs="Times New Roman" w:eastAsia="Times New Roman" w:hAnsi="Times New Roman"/>
+          <w:b w:val="1"/>
+          <w:bCs w:val="1"/>
+          <w:sz w:val="24"/>
+          <w:szCs w:val="24"/>
+          <w:rtl w:val="0"/>
+        </w:rPr>
+        <w:t xml:space="preserve">Demodulación: </w:t>
+      </w:r>
+      <w:r>
+        <w:rPr>
+          <w:rFonts w:ascii="Times New Roman" w:cs="Times New Roman" w:eastAsia="Times New Roman" w:hAnsi="Times New Roman"/>
+          <w:sz w:val="24"/>
+          <w:szCs w:val="24"/>
+          <w:rtl w:val="0"/>
+        </w:rPr>
+        <w:t xml:space="preserve">Proceso de recuperar la información original a partir de la señal modulada. En este proyecto la realizan el receptor IR (elimina la portadora) y el Arduino (interpreta la duración de las pulsaciones).</w:t>
+      </w:r>
+    </w:p>
+    <w:p>
+      <w:pPr>
+        <w:spacing w:line="276" w:lineRule="auto"/>
+        <w:jc w:val="both"/>
+        <w:rPr>
+          <w:rFonts w:ascii="Times New Roman" w:cs="Times New Roman" w:eastAsia="Times New Roman" w:hAnsi="Times New Roman"/>
+          <w:sz w:val="24"/>
+          <w:szCs w:val="24"/>
+        </w:rPr>
+      </w:pPr>
+      <w:r>
+        <w:rPr>
+          <w:rFonts w:ascii="Times New Roman" w:cs="Times New Roman" w:eastAsia="Times New Roman" w:hAnsi="Times New Roman"/>
+          <w:b w:val="1"/>
+          <w:bCs w:val="1"/>
+          <w:sz w:val="24"/>
+          <w:szCs w:val="24"/>
+          <w:rtl w:val="0"/>
+        </w:rPr>
+        <w:t xml:space="preserve">Pantalla LCD 16x2 con I2C: </w:t>
+      </w:r>
+      <w:r>
+        <w:rPr>
+          <w:rFonts w:ascii="Times New Roman" w:cs="Times New Roman" w:eastAsia="Times New Roman" w:hAnsi="Times New Roman"/>
+          <w:sz w:val="24"/>
+          <w:szCs w:val="24"/>
+          <w:rtl w:val="0"/>
+        </w:rPr>
+        <w:t xml:space="preserve">Pantalla de cristal líquido de 2 filas y 16 caracteres que se comunica con el Arduino mediante el bus I2C, usando solo dos líneas de datos (SDA y SCL).</w:t>
+      </w:r>
+    </w:p>
+    <w:p>
+      <w:pPr>
+        <w:spacing w:line="276" w:lineRule="auto"/>
+        <w:jc w:val="both"/>
+        <w:rPr>
+          <w:rFonts w:ascii="Times New Roman" w:cs="Times New Roman" w:eastAsia="Times New Roman" w:hAnsi="Times New Roman"/>
+          <w:sz w:val="24"/>
+          <w:szCs w:val="24"/>
+        </w:rPr>
+      </w:pPr>
+      <w:r>
+        <w:rPr>
+          <w:rFonts w:ascii="Times New Roman" w:cs="Times New Roman" w:eastAsia="Times New Roman" w:hAnsi="Times New Roman"/>
+          <w:b w:val="1"/>
+          <w:bCs w:val="1"/>
+          <w:sz w:val="24"/>
+          <w:szCs w:val="24"/>
+          <w:rtl w:val="0"/>
+        </w:rPr>
+        <w:t xml:space="preserve">Relación señal/ruido: </w:t>
+      </w:r>
+      <w:r>
+        <w:rPr>
+          <w:rFonts w:ascii="Times New Roman" w:cs="Times New Roman" w:eastAsia="Times New Roman" w:hAnsi="Times New Roman"/>
+          <w:sz w:val="24"/>
+          <w:szCs w:val="24"/>
+          <w:rtl w:val="0"/>
+        </w:rPr>
+        <w:t xml:space="preserve">Proporción entre la potencia de la señal útil y la del ruido de fondo. En este sistema el ruido proviene principalmente de la luz solar y de las lámparas.</w:t>
+      </w:r>
+    </w:p>
+    <w:p>
+      <w:pPr>
+        <w:pBdr>
+          <w:top w:space="0" w:sz="0" w:val="nil"/>
+          <w:left w:space="0" w:sz="0" w:val="nil"/>
+          <w:bottom w:space="0" w:sz="0" w:val="nil"/>
+          <w:right w:space="0" w:sz="0" w:val="nil"/>
+          <w:between w:space="0" w:sz="0" w:val="nil"/>
+        </w:pBdr>
+        <w:shd w:fill="auto" w:val="clear"/>
+        <w:rPr>
+          <w:rFonts w:ascii="Times New Roman" w:cs="Times New Roman" w:eastAsia="Times New Roman" w:hAnsi="Times New Roman"/>
+          <w:sz w:val="24"/>
+          <w:szCs w:val="24"/>
+        </w:rPr>
+      </w:pPr>
+      <w:r>
+        <w:rPr>
+          <w:rtl w:val="0"/>
+        </w:rPr>
+      </w:r>
+    </w:p>
+    <w:p>
+      <w:pPr>
+        <w:pBdr>
+          <w:top w:space="0" w:sz="0" w:val="nil"/>
+          <w:left w:space="0" w:sz="0" w:val="nil"/>
+          <w:bottom w:space="0" w:sz="0" w:val="nil"/>
+          <w:right w:space="0" w:sz="0" w:val="nil"/>
+          <w:between w:space="0" w:sz="0" w:val="nil"/>
+        </w:pBdr>
+        <w:shd w:fill="auto" w:val="clear"/>
+        <w:spacing w:line="360" w:lineRule="auto"/>
+        <w:rPr>
+          <w:rFonts w:ascii="Impact" w:cs="Impact" w:eastAsia="Impact" w:hAnsi="Impact"/>
+          <w:sz w:val="24"/>
+          <w:szCs w:val="24"/>
+        </w:rPr>
+      </w:pPr>
+      <w:r>
+        <w:rPr>
+          <w:rFonts w:ascii="Impact" w:cs="Impact" w:eastAsia="Impact" w:hAnsi="Impact"/>
+          <w:sz w:val="24"/>
+          <w:szCs w:val="24"/>
+          <w:rtl w:val="0"/>
+        </w:rPr>
+        <w:t xml:space="preserve">4. Antecedentes de Investigación</w:t>
+      </w:r>
+    </w:p>
+    <w:p>
+      <w:pPr>
+        <w:pBdr>
+          <w:top w:space="0" w:sz="0" w:val="nil"/>
+          <w:left w:space="0" w:sz="0" w:val="nil"/>
+          <w:bottom w:space="0" w:sz="0" w:val="nil"/>
+          <w:right w:space="0" w:sz="0" w:val="nil"/>
+          <w:between w:space="0" w:sz="0" w:val="nil"/>
+        </w:pBdr>
+        <w:shd w:fill="auto" w:val="clear"/>
+        <w:spacing w:line="360" w:lineRule="auto"/>
+        <w:rPr>
+          <w:rFonts w:ascii="Times New Roman" w:cs="Times New Roman" w:eastAsia="Times New Roman" w:hAnsi="Times New Roman"/>
+          <w:sz w:val="24"/>
+          <w:szCs w:val="24"/>
+        </w:rPr>
+      </w:pPr>
+      <w:r>
+        <w:rPr>
+          <w:rFonts w:ascii="Times New Roman" w:cs="Times New Roman" w:eastAsia="Times New Roman" w:hAnsi="Times New Roman"/>
+          <w:sz w:val="24"/>
+          <w:szCs w:val="24"/>
+          <w:rtl w:val="0"/>
+        </w:rPr>
+        <w:t xml:space="preserve">- Gómez, M., &amp; Rodríguez, F. (2023). Análisis de rendimiento de sistemas Li-Fi en entornos interiores con interferencia de luz ambiental. Revista Iberoamericana de Telecomunicaciones, 15(2), 45-58.</w:t>
+      </w:r>
+    </w:p>
+    <w:p>
+      <w:pPr>
+        <w:pBdr>
+          <w:top w:space="0" w:sz="0" w:val="nil"/>
+          <w:left w:space="0" w:sz="0" w:val="nil"/>
+          <w:bottom w:space="0" w:sz="0" w:val="nil"/>
+          <w:right w:space="0" w:sz="0" w:val="nil"/>
+          <w:between w:space="0" w:sz="0" w:val="nil"/>
+        </w:pBdr>
+        <w:shd w:fill="auto" w:val="clear"/>
+        <w:spacing w:line="360" w:lineRule="auto"/>
+        <w:rPr>
+          <w:rFonts w:ascii="Times New Roman" w:cs="Times New Roman" w:eastAsia="Times New Roman" w:hAnsi="Times New Roman"/>
+          <w:sz w:val="24"/>
+          <w:szCs w:val="24"/>
+        </w:rPr>
+      </w:pPr>
+      <w:r>
+        <w:rPr>
+          <w:rFonts w:ascii="Times New Roman" w:cs="Times New Roman" w:eastAsia="Times New Roman" w:hAnsi="Times New Roman"/>
+          <w:sz w:val="24"/>
+          <w:szCs w:val="24"/>
+          <w:rtl w:val="0"/>
+        </w:rPr>
+        <w:t xml:space="preserve">- Haas, H., &amp; Chen, C. (2022). Advances in high-speed visible light communication using micro-LED arrays. IEEE Transactions on Wireless Communications, 21(8), 6102-6115.</w:t>
+      </w:r>
+    </w:p>
+    <w:p>
+      <w:pPr>
+        <w:pBdr>
+          <w:top w:space="0" w:sz="0" w:val="nil"/>
+          <w:left w:space="0" w:sz="0" w:val="nil"/>
+          <w:bottom w:space="0" w:sz="0" w:val="nil"/>
+          <w:right w:space="0" w:sz="0" w:val="nil"/>
+          <w:between w:space="0" w:sz="0" w:val="nil"/>
+        </w:pBdr>
+        <w:shd w:fill="auto" w:val="clear"/>
+        <w:spacing w:line="360" w:lineRule="auto"/>
+        <w:rPr>
+          <w:rFonts w:ascii="Times New Roman" w:cs="Times New Roman" w:eastAsia="Times New Roman" w:hAnsi="Times New Roman"/>
+          <w:sz w:val="24"/>
+          <w:szCs w:val="24"/>
+        </w:rPr>
+      </w:pPr>
+      <w:r>
+        <w:rPr>
+          <w:rFonts w:ascii="Times New Roman" w:cs="Times New Roman" w:eastAsia="Times New Roman" w:hAnsi="Times New Roman"/>
+          <w:sz w:val="24"/>
+          <w:szCs w:val="24"/>
+          <w:rtl w:val="0"/>
+        </w:rPr>
+        <w:t xml:space="preserve">- Martínez, J., López, E., &amp; Torres, R. (2024). Prototipado de bajo costo para transmisión de audio analógico mediante comunicación por luz visible. Journal of Applied Optics and Electronics, 9(1), 12-24.</w:t>
+      </w:r>
+    </w:p>
+    <w:p>
+      <w:pPr>
+        <w:spacing w:line="360" w:lineRule="auto"/>
+        <w:jc w:val="both"/>
+        <w:rPr>
+          <w:rFonts w:ascii="Times New Roman" w:cs="Times New Roman" w:eastAsia="Times New Roman" w:hAnsi="Times New Roman"/>
+          <w:sz w:val="24"/>
+          <w:szCs w:val="24"/>
+        </w:rPr>
+      </w:pPr>
+      <w:r>
+        <w:rPr>
+          <w:rFonts w:ascii="Times New Roman" w:cs="Times New Roman" w:eastAsia="Times New Roman" w:hAnsi="Times New Roman"/>
+          <w:sz w:val="24"/>
+          <w:szCs w:val="24"/>
+          <w:rtl w:val="0"/>
+        </w:rPr>
+        <w:t xml:space="preserve">- Kahn, J. M., &amp; Barry, J. R. (1997). Wireless infrared communications. Proceedings of the IEEE, 85(2), 265-298.</w:t>
+      </w:r>
+    </w:p>
+    <w:p>
+      <w:pPr>
+        <w:spacing w:line="360" w:lineRule="auto"/>
+        <w:jc w:val="both"/>
+        <w:rPr>
+          <w:rFonts w:ascii="Times New Roman" w:cs="Times New Roman" w:eastAsia="Times New Roman" w:hAnsi="Times New Roman"/>
+          <w:sz w:val="24"/>
+          <w:szCs w:val="24"/>
+        </w:rPr>
+      </w:pPr>
+      <w:r>
+        <w:rPr>
+          <w:rFonts w:ascii="Times New Roman" w:cs="Times New Roman" w:eastAsia="Times New Roman" w:hAnsi="Times New Roman"/>
+          <w:sz w:val="24"/>
+          <w:szCs w:val="24"/>
+          <w:rtl w:val="0"/>
+        </w:rPr>
+        <w:t xml:space="preserve">- International Telecommunication Union. (2009). Recommendation ITU-R M.1677-1: International Morse code. ITU-R.</w:t>
+      </w:r>
+    </w:p>
+    <w:p>
+      <w:pPr>
+        <w:spacing w:line="360" w:lineRule="auto"/>
+        <w:jc w:val="both"/>
+        <w:rPr>
+          <w:rFonts w:ascii="Times New Roman" w:cs="Times New Roman" w:eastAsia="Times New Roman" w:hAnsi="Times New Roman"/>
+          <w:sz w:val="24"/>
+          <w:szCs w:val="24"/>
+        </w:rPr>
+      </w:pPr>
+      <w:r>
+        <w:rPr>
+          <w:rFonts w:ascii="Times New Roman" w:cs="Times New Roman" w:eastAsia="Times New Roman" w:hAnsi="Times New Roman"/>
+          <w:sz w:val="24"/>
+          <w:szCs w:val="24"/>
+          <w:rtl w:val="0"/>
+        </w:rPr>
+        <w:t xml:space="preserve">- Vishay Semiconductors. TSOP382.., TSOP384.. IR Receiver Modules for Remote Control Systems [Hoja de datos].</w:t>
+      </w:r>
+    </w:p>
+    <w:p>
+      <w:pPr>
+        <w:spacing w:line="360" w:lineRule="auto"/>
+        <w:jc w:val="both"/>
+        <w:rPr>
+          <w:rFonts w:ascii="Times New Roman" w:cs="Times New Roman" w:eastAsia="Times New Roman" w:hAnsi="Times New Roman"/>
+          <w:sz w:val="24"/>
+          <w:szCs w:val="24"/>
+        </w:rPr>
+      </w:pPr>
+      <w:r>
+        <w:rPr>
+          <w:rFonts w:ascii="Times New Roman" w:cs="Times New Roman" w:eastAsia="Times New Roman" w:hAnsi="Times New Roman"/>
+          <w:sz w:val="24"/>
+          <w:szCs w:val="24"/>
+          <w:rtl w:val="0"/>
+        </w:rPr>
+        <w:t xml:space="preserve">- Joachimsmeyer, A., et al. Arduino-IRremote [Software]. GitHub. https://github.com/Arduino-IRremote/Arduino-IRremote</w:t>
+      </w:r>
+    </w:p>
+    <w:p>
+      <w:pPr>
+        <w:pBdr>
+          <w:top w:space="0" w:sz="0" w:val="nil"/>
+          <w:left w:space="0" w:sz="0" w:val="nil"/>
+          <w:bottom w:space="0" w:sz="0" w:val="nil"/>
+          <w:right w:space="0" w:sz="0" w:val="nil"/>
+          <w:between w:space="0" w:sz="0" w:val="nil"/>
+        </w:pBdr>
+        <w:shd w:fill="auto" w:val="clear"/>
+        <w:rPr>
+          <w:rFonts w:ascii="Times New Roman" w:cs="Times New Roman" w:eastAsia="Times New Roman" w:hAnsi="Times New Roman"/>
+          <w:sz w:val="24"/>
+          <w:szCs w:val="24"/>
+        </w:rPr>
+      </w:pPr>
+      <w:r>
+        <w:rPr>
+          <w:rtl w:val="0"/>
+        </w:rPr>
+      </w:r>
+    </w:p>
+    <w:p>
+      <w:pPr>
+        <w:pBdr>
+          <w:top w:space="0" w:sz="0" w:val="nil"/>
+          <w:left w:space="0" w:sz="0" w:val="nil"/>
+          <w:bottom w:space="0" w:sz="0" w:val="nil"/>
+          <w:right w:space="0" w:sz="0" w:val="nil"/>
+          <w:between w:space="0" w:sz="0" w:val="nil"/>
+        </w:pBdr>
+        <w:shd w:fill="auto" w:val="clear"/>
+        <w:spacing w:line="360" w:lineRule="auto"/>
+        <w:rPr>
+          <w:rFonts w:ascii="Impact" w:cs="Impact" w:eastAsia="Impact" w:hAnsi="Impact"/>
+          <w:sz w:val="24"/>
+          <w:szCs w:val="24"/>
+        </w:rPr>
+      </w:pPr>
+      <w:r>
+        <w:rPr>
+          <w:rFonts w:ascii="Impact" w:cs="Impact" w:eastAsia="Impact" w:hAnsi="Impact"/>
+          <w:sz w:val="24"/>
+          <w:szCs w:val="24"/>
+          <w:rtl w:val="0"/>
+        </w:rPr>
+        <w:t xml:space="preserve">5. Materiales</w:t>
+      </w:r>
+    </w:p>
+    <w:p>
+      <w:pPr>
+        <w:spacing w:line="360" w:lineRule="auto"/>
+        <w:jc w:val="both"/>
+        <w:rPr>
+          <w:rFonts w:ascii="Times New Roman" w:cs="Times New Roman" w:eastAsia="Times New Roman" w:hAnsi="Times New Roman"/>
+          <w:sz w:val="24"/>
+          <w:szCs w:val="24"/>
+        </w:rPr>
+      </w:pPr>
+      <w:r>
+        <w:rPr>
+          <w:rFonts w:ascii="Times New Roman" w:cs="Times New Roman" w:eastAsia="Times New Roman" w:hAnsi="Times New Roman"/>
+          <w:b w:val="1"/>
+          <w:bCs w:val="1"/>
+          <w:sz w:val="24"/>
+          <w:szCs w:val="24"/>
+          <w:rtl w:val="0"/>
+        </w:rPr>
+        <w:t xml:space="preserve">Emisor óptico: </w:t>
+      </w:r>
+      <w:r>
+        <w:rPr>
+          <w:rFonts w:ascii="Times New Roman" w:cs="Times New Roman" w:eastAsia="Times New Roman" w:hAnsi="Times New Roman"/>
+          <w:sz w:val="24"/>
+          <w:szCs w:val="24"/>
+          <w:rtl w:val="0"/>
+        </w:rPr>
+        <w:t xml:space="preserve">Control remoto infrarrojo (protocolo NEC, como el incluido en los kits de Arduino), que emite luz infrarroja de aproximadamente 940 nm modulada a 38 kHz.</w:t>
+      </w:r>
+    </w:p>
+    <w:p>
+      <w:pPr>
+        <w:spacing w:line="360" w:lineRule="auto"/>
+        <w:jc w:val="both"/>
+        <w:rPr>
+          <w:rFonts w:ascii="Times New Roman" w:cs="Times New Roman" w:eastAsia="Times New Roman" w:hAnsi="Times New Roman"/>
+          <w:sz w:val="24"/>
+          <w:szCs w:val="24"/>
+        </w:rPr>
+      </w:pPr>
+      <w:r>
+        <w:rPr>
+          <w:rFonts w:ascii="Times New Roman" w:cs="Times New Roman" w:eastAsia="Times New Roman" w:hAnsi="Times New Roman"/>
+          <w:b w:val="1"/>
+          <w:bCs w:val="1"/>
+          <w:sz w:val="24"/>
+          <w:szCs w:val="24"/>
+          <w:rtl w:val="0"/>
+        </w:rPr>
+        <w:t xml:space="preserve">Receptor óptico: </w:t>
+      </w:r>
+      <w:r>
+        <w:rPr>
+          <w:rFonts w:ascii="Times New Roman" w:cs="Times New Roman" w:eastAsia="Times New Roman" w:hAnsi="Times New Roman"/>
+          <w:sz w:val="24"/>
+          <w:szCs w:val="24"/>
+          <w:rtl w:val="0"/>
+        </w:rPr>
+        <w:t xml:space="preserve">Módulo receptor IR VS1838B / TSOP1838 (o módulo KY-022), con filtro de 38 kHz y salida digital.</w:t>
+      </w:r>
+    </w:p>
+    <w:p>
+      <w:pPr>
+        <w:spacing w:line="360" w:lineRule="auto"/>
+        <w:jc w:val="both"/>
+        <w:rPr>
+          <w:rFonts w:ascii="Times New Roman" w:cs="Times New Roman" w:eastAsia="Times New Roman" w:hAnsi="Times New Roman"/>
+          <w:sz w:val="24"/>
+          <w:szCs w:val="24"/>
+        </w:rPr>
+      </w:pPr>
+      <w:r>
+        <w:rPr>
+          <w:rFonts w:ascii="Times New Roman" w:cs="Times New Roman" w:eastAsia="Times New Roman" w:hAnsi="Times New Roman"/>
+          <w:b w:val="1"/>
+          <w:bCs w:val="1"/>
+          <w:sz w:val="24"/>
+          <w:szCs w:val="24"/>
+          <w:rtl w:val="0"/>
+        </w:rPr>
+        <w:t xml:space="preserve">Control y procesamiento: </w:t>
+      </w:r>
+      <w:r>
+        <w:rPr>
+          <w:rFonts w:ascii="Times New Roman" w:cs="Times New Roman" w:eastAsia="Times New Roman" w:hAnsi="Times New Roman"/>
+          <w:sz w:val="24"/>
+          <w:szCs w:val="24"/>
+          <w:rtl w:val="0"/>
+        </w:rPr>
+        <w:t xml:space="preserve">Microcontrolador Arduino Uno.</w:t>
       </w:r>
     </w:p>
     <w:p>
@@ -1772,28 +2044,64 @@
     </w:p>
     <w:p>
       <w:pPr>
-        <w:pBdr>
-          <w:top w:space="0" w:sz="0" w:val="nil"/>
-          <w:left w:space="0" w:sz="0" w:val="nil"/>
-          <w:bottom w:space="0" w:sz="0" w:val="nil"/>
-          <w:right w:space="0" w:sz="0" w:val="nil"/>
-          <w:between w:space="0" w:sz="0" w:val="nil"/>
-        </w:pBdr>
-        <w:shd w:fill="auto" w:val="clear"/>
-        <w:rPr>
-          <w:rFonts w:ascii="Times New Roman" w:cs="Times New Roman" w:eastAsia="Times New Roman" w:hAnsi="Times New Roman"/>
-          <w:sz w:val="24"/>
-          <w:szCs w:val="24"/>
-        </w:rPr>
-      </w:pPr>
-      <w:r>
-        <w:rPr>
-          <w:rFonts w:ascii="Times New Roman" w:cs="Times New Roman" w:eastAsia="Times New Roman" w:hAnsi="Times New Roman"/>
-          <w:sz w:val="24"/>
-          <w:szCs w:val="24"/>
-          <w:rtl w:val="0"/>
-        </w:rPr>
-        <w:t xml:space="preserve">Componentes Pasivos y Varios: Resistencias, potenciómetros para el ajuste de umbral del comparador, condensadores cerámicos y protoboard:</w:t>
+        <w:spacing w:line="360" w:lineRule="auto"/>
+        <w:jc w:val="both"/>
+        <w:rPr>
+          <w:rFonts w:ascii="Times New Roman" w:cs="Times New Roman" w:eastAsia="Times New Roman" w:hAnsi="Times New Roman"/>
+          <w:sz w:val="24"/>
+          <w:szCs w:val="24"/>
+        </w:rPr>
+      </w:pPr>
+      <w:r>
+        <w:rPr>
+          <w:rFonts w:ascii="Times New Roman" w:cs="Times New Roman" w:eastAsia="Times New Roman" w:hAnsi="Times New Roman"/>
+          <w:b w:val="1"/>
+          <w:bCs w:val="1"/>
+          <w:sz w:val="24"/>
+          <w:szCs w:val="24"/>
+          <w:rtl w:val="0"/>
+        </w:rPr>
+        <w:t xml:space="preserve">Visualización: </w:t>
+      </w:r>
+      <w:r>
+        <w:rPr>
+          <w:rFonts w:ascii="Times New Roman" w:cs="Times New Roman" w:eastAsia="Times New Roman" w:hAnsi="Times New Roman"/>
+          <w:sz w:val="24"/>
+          <w:szCs w:val="24"/>
+          <w:rtl w:val="0"/>
+        </w:rPr>
+        <w:t xml:space="preserve">Pantalla LCD 16x2 con módulo adaptador I2C (dirección 0x27 o 0x3F).</w:t>
+      </w:r>
+    </w:p>
+    <w:p>
+      <w:pPr>
+        <w:spacing w:line="360" w:lineRule="auto"/>
+        <w:jc w:val="both"/>
+        <w:rPr>
+          <w:rFonts w:ascii="Times New Roman" w:cs="Times New Roman" w:eastAsia="Times New Roman" w:hAnsi="Times New Roman"/>
+          <w:sz w:val="24"/>
+          <w:szCs w:val="24"/>
+        </w:rPr>
+      </w:pPr>
+      <w:r>
+        <w:rPr>
+          <w:rFonts w:ascii="Times New Roman" w:cs="Times New Roman" w:eastAsia="Times New Roman" w:hAnsi="Times New Roman"/>
+          <w:b w:val="1"/>
+          <w:bCs w:val="1"/>
+          <w:sz w:val="24"/>
+          <w:szCs w:val="24"/>
+          <w:rtl w:val="0"/>
+        </w:rPr>
+        <w:t xml:space="preserve">Componentes varios: </w:t>
+      </w:r>
+      <w:r>
+        <w:rPr>
+          <w:rFonts w:ascii="Times New Roman" w:cs="Times New Roman" w:eastAsia="Times New Roman" w:hAnsi="Times New Roman"/>
+          <w:sz w:val="24"/>
+          <w:szCs w:val="24"/>
+          <w:rtl w:val="0"/>
+        </w:rPr>
+        <w:t xml:space="preserve">Protoboard, cables jumper, cable USB, y buzzer activo y LED indicador (opcionales).</w:t>
       </w:r>
     </w:p>
     <w:p>
@@ -1859,6 +2167,59 @@
     </w:p>
     <w:p>
       <w:pPr>
+        <w:spacing w:line="360" w:lineRule="auto"/>
+        <w:jc w:val="both"/>
+        <w:rPr>
+          <w:rFonts w:ascii="Times New Roman" w:cs="Times New Roman" w:eastAsia="Times New Roman" w:hAnsi="Times New Roman"/>
+          <w:sz w:val="24"/>
+          <w:szCs w:val="24"/>
+        </w:rPr>
+      </w:pPr>
+      <w:r>
+        <w:rPr>
+          <w:rFonts w:ascii="Times New Roman" w:cs="Times New Roman" w:eastAsia="Times New Roman" w:hAnsi="Times New Roman"/>
+          <w:b w:val="1"/>
+          <w:bCs w:val="1"/>
+          <w:sz w:val="24"/>
+          <w:szCs w:val="24"/>
+          <w:rtl w:val="0"/>
+        </w:rPr>
+        <w:t xml:space="preserve">Software: </w:t>
+      </w:r>
+      <w:r>
+        <w:rPr>
+          <w:rFonts w:ascii="Times New Roman" w:cs="Times New Roman" w:eastAsia="Times New Roman" w:hAnsi="Times New Roman"/>
+          <w:sz w:val="24"/>
+          <w:szCs w:val="24"/>
+          <w:rtl w:val="0"/>
+        </w:rPr>
+        <w:t xml:space="preserve">Arduino IDE 2 con las librerías IRremote (versión 4.x) y LiquidCrystal I2C.</w:t>
+      </w:r>
+    </w:p>
+    <w:p>
+      <w:pPr>
+        <w:pBdr>
+          <w:top w:space="0" w:sz="0" w:val="nil"/>
+          <w:left w:space="0" w:sz="0" w:val="nil"/>
+          <w:bottom w:space="0" w:sz="0" w:val="nil"/>
+          <w:right w:space="0" w:sz="0" w:val="nil"/>
+          <w:between w:space="0" w:sz="0" w:val="nil"/>
+        </w:pBdr>
+        <w:shd w:fill="auto" w:val="clear"/>
+        <w:rPr>
+          <w:rFonts w:ascii="Times New Roman" w:cs="Times New Roman" w:eastAsia="Times New Roman" w:hAnsi="Times New Roman"/>
+          <w:sz w:val="24"/>
+          <w:szCs w:val="24"/>
+        </w:rPr>
+      </w:pPr>
+      <w:r>
+        <w:rPr>
+          <w:rtl w:val="0"/>
+        </w:rPr>
+      </w:r>
+    </w:p>
+    <w:p>
+      <w:pPr>
         <w:pBdr>
           <w:top w:space="0" w:sz="0" w:val="nil"/>
           <w:left w:space="0" w:sz="0" w:val="nil"/>
@@ -1886,6 +2247,394 @@
     </w:p>
     <w:p>
       <w:pPr>
+        <w:spacing w:line="360" w:lineRule="auto"/>
+        <w:jc w:val="both"/>
+        <w:rPr>
+          <w:rFonts w:ascii="Times New Roman" w:cs="Times New Roman" w:eastAsia="Times New Roman" w:hAnsi="Times New Roman"/>
+          <w:sz w:val="24"/>
+          <w:szCs w:val="24"/>
+        </w:rPr>
+      </w:pPr>
+      <w:r>
+        <w:rPr>
+          <w:rFonts w:ascii="Times New Roman" w:cs="Times New Roman" w:eastAsia="Times New Roman" w:hAnsi="Times New Roman"/>
+          <w:b w:val="1"/>
+          <w:bCs w:val="1"/>
+          <w:sz w:val="24"/>
+          <w:szCs w:val="24"/>
+          <w:rtl w:val="0"/>
+        </w:rPr>
+        <w:t xml:space="preserve">6.1 Arquitectura del sistema</w:t>
+      </w:r>
+    </w:p>
+    <w:p>
+      <w:pPr>
+        <w:spacing w:line="360" w:lineRule="auto"/>
+        <w:jc w:val="both"/>
+        <w:rPr>
+          <w:rFonts w:ascii="Times New Roman" w:cs="Times New Roman" w:eastAsia="Times New Roman" w:hAnsi="Times New Roman"/>
+          <w:sz w:val="24"/>
+          <w:szCs w:val="24"/>
+        </w:rPr>
+      </w:pPr>
+      <w:r>
+        <w:rPr>
+          <w:rFonts w:ascii="Times New Roman" w:cs="Times New Roman" w:eastAsia="Times New Roman" w:hAnsi="Times New Roman"/>
+          <w:sz w:val="24"/>
+          <w:szCs w:val="24"/>
+          <w:rtl w:val="0"/>
+        </w:rPr>
+        <w:t xml:space="preserve">El sistema se compone de tres etapas: (1) emisión, en la que el control remoto convierte cada pulsación en ráfagas de luz infrarroja moduladas a 38 kHz; (2) recepción y demodulación, en la que el módulo VS1838B filtra la portadora y entrega una señal digital; y (3) procesamiento y visualización, en la que el Arduino mide la duración de cada pulsación, la traduce a código Morse y presenta el texto en la pantalla LCD.</w:t>
+      </w:r>
+    </w:p>
+    <w:p>
+      <w:pPr>
+        <w:spacing w:line="360" w:lineRule="auto"/>
+        <w:jc w:val="both"/>
+        <w:rPr>
+          <w:rFonts w:ascii="Times New Roman" w:cs="Times New Roman" w:eastAsia="Times New Roman" w:hAnsi="Times New Roman"/>
+          <w:sz w:val="24"/>
+          <w:szCs w:val="24"/>
+        </w:rPr>
+      </w:pPr>
+      <w:r>
+        <w:rPr>
+          <w:rFonts w:ascii="Times New Roman" w:cs="Times New Roman" w:eastAsia="Times New Roman" w:hAnsi="Times New Roman"/>
+          <w:b w:val="1"/>
+          <w:bCs w:val="1"/>
+          <w:sz w:val="24"/>
+          <w:szCs w:val="24"/>
+          <w:rtl w:val="0"/>
+        </w:rPr>
+        <w:t xml:space="preserve">6.2 Conexiones</w:t>
+      </w:r>
+    </w:p>
+    <w:p>
+      <w:pPr>
+        <w:spacing w:line="360" w:lineRule="auto"/>
+        <w:jc w:val="both"/>
+        <w:rPr>
+          <w:rFonts w:ascii="Times New Roman" w:cs="Times New Roman" w:eastAsia="Times New Roman" w:hAnsi="Times New Roman"/>
+          <w:sz w:val="24"/>
+          <w:szCs w:val="24"/>
+        </w:rPr>
+      </w:pPr>
+      <w:r>
+        <w:rPr>
+          <w:rFonts w:ascii="Times New Roman" w:cs="Times New Roman" w:eastAsia="Times New Roman" w:hAnsi="Times New Roman"/>
+          <w:sz w:val="24"/>
+          <w:szCs w:val="24"/>
+          <w:rtl w:val="0"/>
+        </w:rPr>
+        <w:t xml:space="preserve">- Receptor IR: OUT al pin digital 2; VCC a 5 V; GND a GND.</w:t>
+      </w:r>
+    </w:p>
+    <w:p>
+      <w:pPr>
+        <w:spacing w:line="360" w:lineRule="auto"/>
+        <w:jc w:val="both"/>
+        <w:rPr>
+          <w:rFonts w:ascii="Times New Roman" w:cs="Times New Roman" w:eastAsia="Times New Roman" w:hAnsi="Times New Roman"/>
+          <w:sz w:val="24"/>
+          <w:szCs w:val="24"/>
+        </w:rPr>
+      </w:pPr>
+      <w:r>
+        <w:rPr>
+          <w:rFonts w:ascii="Times New Roman" w:cs="Times New Roman" w:eastAsia="Times New Roman" w:hAnsi="Times New Roman"/>
+          <w:sz w:val="24"/>
+          <w:szCs w:val="24"/>
+          <w:rtl w:val="0"/>
+        </w:rPr>
+        <w:t xml:space="preserve">- Pantalla LCD I2C: SDA al pin A4; SCL al pin A5; VCC a 5 V; GND a GND.</w:t>
+      </w:r>
+    </w:p>
+    <w:p>
+      <w:pPr>
+        <w:spacing w:line="360" w:lineRule="auto"/>
+        <w:jc w:val="both"/>
+        <w:rPr>
+          <w:rFonts w:ascii="Times New Roman" w:cs="Times New Roman" w:eastAsia="Times New Roman" w:hAnsi="Times New Roman"/>
+          <w:sz w:val="24"/>
+          <w:szCs w:val="24"/>
+        </w:rPr>
+      </w:pPr>
+      <w:r>
+        <w:rPr>
+          <w:rFonts w:ascii="Times New Roman" w:cs="Times New Roman" w:eastAsia="Times New Roman" w:hAnsi="Times New Roman"/>
+          <w:sz w:val="24"/>
+          <w:szCs w:val="24"/>
+          <w:rtl w:val="0"/>
+        </w:rPr>
+        <w:t xml:space="preserve">- Buzzer activo (opcional): terminal positivo al pin digital 8; terminal negativo a GND.</w:t>
+      </w:r>
+    </w:p>
+    <w:p>
+      <w:pPr>
+        <w:spacing w:line="360" w:lineRule="auto"/>
+        <w:jc w:val="both"/>
+        <w:rPr>
+          <w:rFonts w:ascii="Times New Roman" w:cs="Times New Roman" w:eastAsia="Times New Roman" w:hAnsi="Times New Roman"/>
+          <w:sz w:val="24"/>
+          <w:szCs w:val="24"/>
+        </w:rPr>
+      </w:pPr>
+      <w:r>
+        <w:rPr>
+          <w:rFonts w:ascii="Times New Roman" w:cs="Times New Roman" w:eastAsia="Times New Roman" w:hAnsi="Times New Roman"/>
+          <w:b w:val="1"/>
+          <w:bCs w:val="1"/>
+          <w:sz w:val="24"/>
+          <w:szCs w:val="24"/>
+          <w:rtl w:val="0"/>
+        </w:rPr>
+        <w:t xml:space="preserve">6.3 Algoritmo de decodificación</w:t>
+      </w:r>
+    </w:p>
+    <w:p>
+      <w:pPr>
+        <w:spacing w:line="360" w:lineRule="auto"/>
+        <w:jc w:val="both"/>
+        <w:rPr>
+          <w:rFonts w:ascii="Times New Roman" w:cs="Times New Roman" w:eastAsia="Times New Roman" w:hAnsi="Times New Roman"/>
+          <w:sz w:val="24"/>
+          <w:szCs w:val="24"/>
+        </w:rPr>
+      </w:pPr>
+      <w:r>
+        <w:rPr>
+          <w:rFonts w:ascii="Times New Roman" w:cs="Times New Roman" w:eastAsia="Times New Roman" w:hAnsi="Times New Roman"/>
+          <w:sz w:val="24"/>
+          <w:szCs w:val="24"/>
+          <w:rtl w:val="0"/>
+        </w:rPr>
+        <w:t xml:space="preserve">- Mientras el botón permanece presionado, el control envía tramas de repetición cada 110 ms aproximadamente. El Arduino considera que el botón se soltó cuando pasan más de 160 ms sin recibir señal.</w:t>
+      </w:r>
+    </w:p>
+    <w:p>
+      <w:pPr>
+        <w:spacing w:line="360" w:lineRule="auto"/>
+        <w:jc w:val="both"/>
+        <w:rPr>
+          <w:rFonts w:ascii="Times New Roman" w:cs="Times New Roman" w:eastAsia="Times New Roman" w:hAnsi="Times New Roman"/>
+          <w:sz w:val="24"/>
+          <w:szCs w:val="24"/>
+        </w:rPr>
+      </w:pPr>
+      <w:r>
+        <w:rPr>
+          <w:rFonts w:ascii="Times New Roman" w:cs="Times New Roman" w:eastAsia="Times New Roman" w:hAnsi="Times New Roman"/>
+          <w:sz w:val="24"/>
+          <w:szCs w:val="24"/>
+          <w:rtl w:val="0"/>
+        </w:rPr>
+        <w:t xml:space="preserve">- Si la pulsación dura menos de 300 ms se interpreta como punto (.); si dura más, como raya (-).</w:t>
+      </w:r>
+    </w:p>
+    <w:p>
+      <w:pPr>
+        <w:spacing w:line="360" w:lineRule="auto"/>
+        <w:jc w:val="both"/>
+        <w:rPr>
+          <w:rFonts w:ascii="Times New Roman" w:cs="Times New Roman" w:eastAsia="Times New Roman" w:hAnsi="Times New Roman"/>
+          <w:sz w:val="24"/>
+          <w:szCs w:val="24"/>
+        </w:rPr>
+      </w:pPr>
+      <w:r>
+        <w:rPr>
+          <w:rFonts w:ascii="Times New Roman" w:cs="Times New Roman" w:eastAsia="Times New Roman" w:hAnsi="Times New Roman"/>
+          <w:sz w:val="24"/>
+          <w:szCs w:val="24"/>
+          <w:rtl w:val="0"/>
+        </w:rPr>
+        <w:t xml:space="preserve">- Un silencio de 800 ms indica el fin de la letra: la secuencia de símbolos se compara con la tabla del código Morse internacional y el carácter se muestra en la primera fila de la LCD.</w:t>
+      </w:r>
+    </w:p>
+    <w:p>
+      <w:pPr>
+        <w:spacing w:line="360" w:lineRule="auto"/>
+        <w:jc w:val="both"/>
+        <w:rPr>
+          <w:rFonts w:ascii="Times New Roman" w:cs="Times New Roman" w:eastAsia="Times New Roman" w:hAnsi="Times New Roman"/>
+          <w:sz w:val="24"/>
+          <w:szCs w:val="24"/>
+        </w:rPr>
+      </w:pPr>
+      <w:r>
+        <w:rPr>
+          <w:rFonts w:ascii="Times New Roman" w:cs="Times New Roman" w:eastAsia="Times New Roman" w:hAnsi="Times New Roman"/>
+          <w:sz w:val="24"/>
+          <w:szCs w:val="24"/>
+          <w:rtl w:val="0"/>
+        </w:rPr>
+        <w:t xml:space="preserve">- Un silencio de 2,5 s inserta un espacio entre palabras. La segunda fila de la LCD muestra los símbolos que se están ingresando y la letra que formarían.</w:t>
+      </w:r>
+    </w:p>
+    <w:p>
+      <w:pPr>
+        <w:spacing w:line="360" w:lineRule="auto"/>
+        <w:jc w:val="both"/>
+        <w:rPr>
+          <w:rFonts w:ascii="Times New Roman" w:cs="Times New Roman" w:eastAsia="Times New Roman" w:hAnsi="Times New Roman"/>
+          <w:sz w:val="24"/>
+          <w:szCs w:val="24"/>
+        </w:rPr>
+      </w:pPr>
+      <w:r>
+        <w:rPr>
+          <w:rFonts w:ascii="Times New Roman" w:cs="Times New Roman" w:eastAsia="Times New Roman" w:hAnsi="Times New Roman"/>
+          <w:sz w:val="24"/>
+          <w:szCs w:val="24"/>
+          <w:rtl w:val="0"/>
+        </w:rPr>
+        <w:t xml:space="preserve">- Tres botones del control se reservan como funciones: insertar espacio, borrar el último carácter y limpiar la pantalla.</w:t>
+      </w:r>
+    </w:p>
+    <w:p>
+      <w:pPr>
+        <w:spacing w:line="360" w:lineRule="auto"/>
+        <w:jc w:val="both"/>
+        <w:rPr>
+          <w:rFonts w:ascii="Times New Roman" w:cs="Times New Roman" w:eastAsia="Times New Roman" w:hAnsi="Times New Roman"/>
+          <w:sz w:val="24"/>
+          <w:szCs w:val="24"/>
+        </w:rPr>
+      </w:pPr>
+      <w:r>
+        <w:rPr>
+          <w:rFonts w:ascii="Times New Roman" w:cs="Times New Roman" w:eastAsia="Times New Roman" w:hAnsi="Times New Roman"/>
+          <w:sz w:val="24"/>
+          <w:szCs w:val="24"/>
+          <w:rtl w:val="0"/>
+        </w:rPr>
+        <w:t xml:space="preserve">- Los tiempos anteriores son parámetros del programa y pueden ajustarse según la destreza del usuario.</w:t>
+      </w:r>
+    </w:p>
+    <w:p>
+      <w:pPr>
+        <w:spacing w:line="360" w:lineRule="auto"/>
+        <w:jc w:val="both"/>
+        <w:rPr>
+          <w:rFonts w:ascii="Times New Roman" w:cs="Times New Roman" w:eastAsia="Times New Roman" w:hAnsi="Times New Roman"/>
+          <w:sz w:val="24"/>
+          <w:szCs w:val="24"/>
+        </w:rPr>
+      </w:pPr>
+      <w:r>
+        <w:rPr>
+          <w:rFonts w:ascii="Times New Roman" w:cs="Times New Roman" w:eastAsia="Times New Roman" w:hAnsi="Times New Roman"/>
+          <w:b w:val="1"/>
+          <w:bCs w:val="1"/>
+          <w:sz w:val="24"/>
+          <w:szCs w:val="24"/>
+          <w:rtl w:val="0"/>
+        </w:rPr>
+        <w:t xml:space="preserve">6.4 Plan de pruebas</w:t>
+      </w:r>
+    </w:p>
+    <w:p>
+      <w:pPr>
+        <w:spacing w:line="360" w:lineRule="auto"/>
+        <w:jc w:val="both"/>
+        <w:rPr>
+          <w:rFonts w:ascii="Times New Roman" w:cs="Times New Roman" w:eastAsia="Times New Roman" w:hAnsi="Times New Roman"/>
+          <w:sz w:val="24"/>
+          <w:szCs w:val="24"/>
+        </w:rPr>
+      </w:pPr>
+      <w:r>
+        <w:rPr>
+          <w:rFonts w:ascii="Times New Roman" w:cs="Times New Roman" w:eastAsia="Times New Roman" w:hAnsi="Times New Roman"/>
+          <w:sz w:val="24"/>
+          <w:szCs w:val="24"/>
+          <w:rtl w:val="0"/>
+        </w:rPr>
+        <w:t xml:space="preserve">- Precisión: transmitir mensajes de prueba (por ejemplo, "SOS" y "HOLA MUNDO") y calcular el porcentaje de caracteres decodificados correctamente.</w:t>
+      </w:r>
+    </w:p>
+    <w:p>
+      <w:pPr>
+        <w:spacing w:line="360" w:lineRule="auto"/>
+        <w:jc w:val="both"/>
+        <w:rPr>
+          <w:rFonts w:ascii="Times New Roman" w:cs="Times New Roman" w:eastAsia="Times New Roman" w:hAnsi="Times New Roman"/>
+          <w:sz w:val="24"/>
+          <w:szCs w:val="24"/>
+        </w:rPr>
+      </w:pPr>
+      <w:r>
+        <w:rPr>
+          <w:rFonts w:ascii="Times New Roman" w:cs="Times New Roman" w:eastAsia="Times New Roman" w:hAnsi="Times New Roman"/>
+          <w:sz w:val="24"/>
+          <w:szCs w:val="24"/>
+          <w:rtl w:val="0"/>
+        </w:rPr>
+        <w:t xml:space="preserve">- Alcance: repetir la transmisión aumentando la distancia cada 0,5 m hasta que la decodificación falle.</w:t>
+      </w:r>
+    </w:p>
+    <w:p>
+      <w:pPr>
+        <w:spacing w:line="360" w:lineRule="auto"/>
+        <w:jc w:val="both"/>
+        <w:rPr>
+          <w:rFonts w:ascii="Times New Roman" w:cs="Times New Roman" w:eastAsia="Times New Roman" w:hAnsi="Times New Roman"/>
+          <w:sz w:val="24"/>
+          <w:szCs w:val="24"/>
+        </w:rPr>
+      </w:pPr>
+      <w:r>
+        <w:rPr>
+          <w:rFonts w:ascii="Times New Roman" w:cs="Times New Roman" w:eastAsia="Times New Roman" w:hAnsi="Times New Roman"/>
+          <w:sz w:val="24"/>
+          <w:szCs w:val="24"/>
+          <w:rtl w:val="0"/>
+        </w:rPr>
+        <w:t xml:space="preserve">- Ángulo de recepción: medir la recepción variando el ángulo entre el control y el receptor.</w:t>
+      </w:r>
+    </w:p>
+    <w:p>
+      <w:pPr>
+        <w:spacing w:line="360" w:lineRule="auto"/>
+        <w:jc w:val="both"/>
+        <w:rPr>
+          <w:rFonts w:ascii="Times New Roman" w:cs="Times New Roman" w:eastAsia="Times New Roman" w:hAnsi="Times New Roman"/>
+          <w:sz w:val="24"/>
+          <w:szCs w:val="24"/>
+        </w:rPr>
+      </w:pPr>
+      <w:r>
+        <w:rPr>
+          <w:rFonts w:ascii="Times New Roman" w:cs="Times New Roman" w:eastAsia="Times New Roman" w:hAnsi="Times New Roman"/>
+          <w:sz w:val="24"/>
+          <w:szCs w:val="24"/>
+          <w:rtl w:val="0"/>
+        </w:rPr>
+        <w:t xml:space="preserve">- Luz ambiental: comparar el desempeño en oscuridad, con luz artificial y con luz solar directa.</w:t>
+      </w:r>
+    </w:p>
+    <w:p>
+      <w:pPr>
+        <w:spacing w:line="360" w:lineRule="auto"/>
+        <w:jc w:val="both"/>
+        <w:rPr>
+          <w:rFonts w:ascii="Times New Roman" w:cs="Times New Roman" w:eastAsia="Times New Roman" w:hAnsi="Times New Roman"/>
+          <w:sz w:val="24"/>
+          <w:szCs w:val="24"/>
+        </w:rPr>
+      </w:pPr>
+      <w:r>
+        <w:rPr>
+          <w:rFonts w:ascii="Times New Roman" w:cs="Times New Roman" w:eastAsia="Times New Roman" w:hAnsi="Times New Roman"/>
+          <w:sz w:val="24"/>
+          <w:szCs w:val="24"/>
+          <w:rtl w:val="0"/>
+        </w:rPr>
+        <w:t xml:space="preserve">- Tiempo de respuesta: registrar en el Monitor Serie la duración medida de cada pulsación.</w:t>
+      </w:r>
+    </w:p>
+    <w:p>
+      <w:pPr>
         <w:pBdr>
           <w:top w:space="0" w:sz="0" w:val="nil"/>
           <w:left w:space="0" w:sz="0" w:val="nil"/>
@@ -1943,7 +2692,6 @@
           <w:between w:space="0" w:sz="0" w:val="nil"/>
         </w:pBdr>
         <w:shd w:fill="auto" w:val="clear"/>
-        <w:spacing w:line="360" w:lineRule="auto"/>
         <w:rPr>
           <w:rFonts w:ascii="Times New Roman" w:cs="Times New Roman" w:eastAsia="Times New Roman" w:hAnsi="Times New Roman"/>
           <w:sz w:val="24"/>

</xml_diff>